<commit_message>
corrected the step for dont wait in modifying in action_plan docx and corrected heading in action plan for contact other parent - it was still the old reference, not the step heading from yml!
</commit_message>
<xml_diff>
--- a/docassemble/ChangingChildCustody/data/templates/changing_child_custody_action_plan.docx
+++ b/docassemble/ChangingChildCustody/data/templates/changing_child_custody_action_plan.docx
@@ -534,15 +534,7 @@
               <w:t xml:space="preserve">Your Action Plan in </w:t>
             </w:r>
             <w:r>
-              <w:t xml:space="preserve">{{ </w:t>
-            </w:r>
-            <w:proofErr w:type="spellStart"/>
-            <w:r>
-              <w:t>step_list</w:t>
-            </w:r>
-            <w:proofErr w:type="spellEnd"/>
-            <w:r>
-              <w:t xml:space="preserve"> | length }}</w:t>
+              <w:t>{{ step_list | length }}</w:t>
             </w:r>
             <w:r>
               <w:t xml:space="preserve"> Steps</w:t>
@@ -594,23 +586,7 @@
               <w:pStyle w:val="Body"/>
             </w:pPr>
             <w:r>
-              <w:t>{%tr if parents_agree or final_order_date_within_15_days or (</w:t>
-            </w:r>
-            <w:proofErr w:type="spellStart"/>
-            <w:r>
-              <w:t>unknown_final_date.true_values</w:t>
-            </w:r>
-            <w:proofErr w:type="spellEnd"/>
-            <w:r>
-              <w:t>())|</w:t>
-            </w:r>
-            <w:proofErr w:type="spellStart"/>
-            <w:r>
-              <w:t>list|length</w:t>
-            </w:r>
-            <w:proofErr w:type="spellEnd"/>
-            <w:r>
-              <w:t xml:space="preserve"> &gt; 1 %}</w:t>
+              <w:t>{%tr if parents_agree or final_order_date_within_15_days or (unknown_final_date.true_values())|list|length &gt; 1 %}</w:t>
             </w:r>
           </w:p>
         </w:tc>
@@ -631,13 +607,8 @@
             <w:pPr>
               <w:pStyle w:val="Body"/>
             </w:pPr>
-            <w:proofErr w:type="spellStart"/>
-            <w:r>
-              <w:t>pick_a_step_step</w:t>
-            </w:r>
-            <w:proofErr w:type="spellEnd"/>
-            <w:r>
-              <w:t xml:space="preserve"> in aka2j_templates.yml</w:t>
+            <w:r>
+              <w:t>pick_a_step_step in aka2j_templates.yml</w:t>
             </w:r>
           </w:p>
         </w:tc>
@@ -665,22 +636,14 @@
               <w:t>{{</w:t>
             </w:r>
             <w:r>
-              <w:t xml:space="preserve"> </w:t>
-            </w:r>
-            <w:proofErr w:type="spellStart"/>
-            <w:r>
-              <w:t>pick_a_step</w:t>
+              <w:t xml:space="preserve"> pick_a_step</w:t>
             </w:r>
             <w:r>
               <w:t>_ste</w:t>
             </w:r>
             <w:r>
               <w:lastRenderedPageBreak/>
-              <w:t>p.subject</w:t>
-            </w:r>
-            <w:proofErr w:type="spellEnd"/>
-            <w:r>
-              <w:t xml:space="preserve"> }}</w:t>
+              <w:t>p.subject }}</w:t>
             </w:r>
           </w:p>
         </w:tc>
@@ -807,21 +770,8 @@
             <w:pPr>
               <w:pStyle w:val="Body"/>
             </w:pPr>
-            <w:proofErr w:type="spellStart"/>
-            <w:r>
-              <w:t>parents_agree_step</w:t>
-            </w:r>
-            <w:proofErr w:type="spellEnd"/>
-            <w:r>
-              <w:t xml:space="preserve">  and </w:t>
-            </w:r>
-            <w:proofErr w:type="spellStart"/>
-            <w:r>
-              <w:t>tell_the_court_step</w:t>
-            </w:r>
-            <w:proofErr w:type="spellEnd"/>
-            <w:r>
-              <w:t xml:space="preserve"> in aka2j_templates.yml</w:t>
+            <w:r>
+              <w:t>parents_agree_step  and tell_the_court_step in aka2j_templates.yml</w:t>
             </w:r>
           </w:p>
         </w:tc>
@@ -846,15 +796,7 @@
               <w:outlineLvl w:val="1"/>
             </w:pPr>
             <w:r>
-              <w:t xml:space="preserve">{{ </w:t>
-            </w:r>
-            <w:proofErr w:type="spellStart"/>
-            <w:r>
-              <w:t>parents_agree_step.subject</w:t>
-            </w:r>
-            <w:proofErr w:type="spellEnd"/>
-            <w:r>
-              <w:t xml:space="preserve"> }}</w:t>
+              <w:t>{{ parents_agree_step.subject }}</w:t>
             </w:r>
           </w:p>
         </w:tc>
@@ -913,15 +855,7 @@
               <w:outlineLvl w:val="1"/>
             </w:pPr>
             <w:r>
-              <w:t xml:space="preserve">{{ </w:t>
-            </w:r>
-            <w:proofErr w:type="spellStart"/>
-            <w:r>
-              <w:t>tell_the_court_step.subject</w:t>
-            </w:r>
-            <w:proofErr w:type="spellEnd"/>
-            <w:r>
-              <w:t xml:space="preserve"> }}</w:t>
+              <w:t>{{ tell_the_court_step.subject }}</w:t>
             </w:r>
           </w:p>
         </w:tc>
@@ -1046,39 +980,24 @@
             <w:pPr>
               <w:pStyle w:val="Body"/>
             </w:pPr>
-            <w:proofErr w:type="spellStart"/>
-            <w:r>
-              <w:t>foreign_order_step</w:t>
-            </w:r>
-            <w:proofErr w:type="spellEnd"/>
-            <w:r>
-              <w:t xml:space="preserve"> in aka2j_mod_cust_div_templates.yml</w:t>
-            </w:r>
-          </w:p>
-          <w:p>
-            <w:pPr>
-              <w:pStyle w:val="Body"/>
-            </w:pPr>
-            <w:proofErr w:type="spellStart"/>
-            <w:r>
-              <w:t>ak_jurisdiction_step</w:t>
-            </w:r>
-            <w:proofErr w:type="spellEnd"/>
-            <w:r>
-              <w:t xml:space="preserve"> in aka2j_templates.yml</w:t>
-            </w:r>
-          </w:p>
-          <w:p>
-            <w:pPr>
-              <w:pStyle w:val="Body"/>
-            </w:pPr>
-            <w:proofErr w:type="spellStart"/>
-            <w:r>
-              <w:t>register_order_step</w:t>
-            </w:r>
-            <w:proofErr w:type="spellEnd"/>
-            <w:r>
-              <w:t xml:space="preserve"> in aka2j_mod_cust_div_templates.yml</w:t>
+            <w:r>
+              <w:t>foreign_order_step in aka2j_mod_cust_div_templates.yml</w:t>
+            </w:r>
+          </w:p>
+          <w:p>
+            <w:pPr>
+              <w:pStyle w:val="Body"/>
+            </w:pPr>
+            <w:r>
+              <w:t>ak_jurisdiction_step in aka2j_templates.yml</w:t>
+            </w:r>
+          </w:p>
+          <w:p>
+            <w:pPr>
+              <w:pStyle w:val="Body"/>
+            </w:pPr>
+            <w:r>
+              <w:t>register_order_step in aka2j_mod_cust_div_templates.yml</w:t>
             </w:r>
           </w:p>
         </w:tc>
@@ -1105,16 +1024,11 @@
             <w:r>
               <w:t xml:space="preserve">{{ </w:t>
             </w:r>
-            <w:proofErr w:type="spellStart"/>
             <w:r>
               <w:t>foreign_order_step</w:t>
             </w:r>
             <w:r>
-              <w:t>.subject</w:t>
-            </w:r>
-            <w:proofErr w:type="spellEnd"/>
-            <w:r>
-              <w:t xml:space="preserve"> }}</w:t>
+              <w:t>.subject }}</w:t>
             </w:r>
           </w:p>
         </w:tc>
@@ -1171,7 +1085,6 @@
               </w:rPr>
               <w:t xml:space="preserve">{{ </w:t>
             </w:r>
-            <w:proofErr w:type="spellStart"/>
             <w:r>
               <w:rPr>
                 <w:shd w:val="clear" w:color="auto" w:fill="FFFFFF"/>
@@ -1182,14 +1095,7 @@
               <w:rPr>
                 <w:shd w:val="clear" w:color="auto" w:fill="FFFFFF"/>
               </w:rPr>
-              <w:t>.subject</w:t>
-            </w:r>
-            <w:proofErr w:type="spellEnd"/>
-            <w:r>
-              <w:rPr>
-                <w:shd w:val="clear" w:color="auto" w:fill="FFFFFF"/>
-              </w:rPr>
-              <w:t xml:space="preserve"> }}</w:t>
+              <w:t>.subject }}</w:t>
             </w:r>
           </w:p>
         </w:tc>
@@ -1257,7 +1163,6 @@
               <w:lastRenderedPageBreak/>
               <w:t xml:space="preserve">{{ </w:t>
             </w:r>
-            <w:proofErr w:type="spellStart"/>
             <w:r>
               <w:rPr>
                 <w:shd w:val="clear" w:color="auto" w:fill="FFFFFF"/>
@@ -1268,14 +1173,7 @@
               <w:rPr>
                 <w:shd w:val="clear" w:color="auto" w:fill="FFFFFF"/>
               </w:rPr>
-              <w:t>.subject</w:t>
-            </w:r>
-            <w:proofErr w:type="spellEnd"/>
-            <w:r>
-              <w:rPr>
-                <w:shd w:val="clear" w:color="auto" w:fill="FFFFFF"/>
-              </w:rPr>
-              <w:t xml:space="preserve"> }}</w:t>
+              <w:t>.subject }}</w:t>
             </w:r>
           </w:p>
         </w:tc>
@@ -1542,13 +1440,8 @@
             <w:pPr>
               <w:pStyle w:val="Body"/>
             </w:pPr>
-            <w:proofErr w:type="spellStart"/>
-            <w:r>
-              <w:t>modify_step</w:t>
-            </w:r>
-            <w:proofErr w:type="spellEnd"/>
-            <w:r>
-              <w:t xml:space="preserve"> in aka2j_mod_cust_div_templates.yml</w:t>
+            <w:r>
+              <w:t>modify_step in aka2j_mod_cust_div_templates.yml</w:t>
             </w:r>
           </w:p>
           <w:p>
@@ -1583,20 +1476,12 @@
               </w:rPr>
               <w:t xml:space="preserve">{{ </w:t>
             </w:r>
-            <w:proofErr w:type="spellStart"/>
             <w:r>
               <w:rPr>
                 <w:shd w:val="clear" w:color="auto" w:fill="FFFFFF"/>
               </w:rPr>
               <w:lastRenderedPageBreak/>
-              <w:t>modify_step.subject</w:t>
-            </w:r>
-            <w:proofErr w:type="spellEnd"/>
-            <w:r>
-              <w:rPr>
-                <w:shd w:val="clear" w:color="auto" w:fill="FFFFFF"/>
-              </w:rPr>
-              <w:t xml:space="preserve"> }}</w:t>
+              <w:t>modify_step.subject }}</w:t>
             </w:r>
           </w:p>
         </w:tc>
@@ -1825,26 +1710,16 @@
             <w:pPr>
               <w:pStyle w:val="Body"/>
             </w:pPr>
-            <w:proofErr w:type="spellStart"/>
-            <w:r>
-              <w:t>fill_modify_step</w:t>
-            </w:r>
-            <w:proofErr w:type="spellEnd"/>
-            <w:r>
-              <w:t xml:space="preserve"> in aka2j_mod_cust_div_templates.yml</w:t>
-            </w:r>
-          </w:p>
-          <w:p>
-            <w:pPr>
-              <w:pStyle w:val="Body"/>
-            </w:pPr>
-            <w:proofErr w:type="spellStart"/>
-            <w:r>
-              <w:t>calculate_child_support_step</w:t>
-            </w:r>
-            <w:proofErr w:type="spellEnd"/>
-            <w:r>
-              <w:t xml:space="preserve"> in aka2j_templates.yml</w:t>
+            <w:r>
+              <w:t>fill_modify_step in aka2j_mod_cust_div_templates.yml</w:t>
+            </w:r>
+          </w:p>
+          <w:p>
+            <w:pPr>
+              <w:pStyle w:val="Body"/>
+            </w:pPr>
+            <w:r>
+              <w:t>calculate_child_support_step in aka2j_templates.yml</w:t>
             </w:r>
           </w:p>
           <w:p>
@@ -1880,21 +1755,7 @@
               <w:rPr>
                 <w:shd w:val="clear" w:color="auto" w:fill="FFFFFF"/>
               </w:rPr>
-              <w:t xml:space="preserve">{{ </w:t>
-            </w:r>
-            <w:proofErr w:type="spellStart"/>
-            <w:r>
-              <w:rPr>
-                <w:shd w:val="clear" w:color="auto" w:fill="FFFFFF"/>
-              </w:rPr>
-              <w:t>fill_modify_step.subject</w:t>
-            </w:r>
-            <w:proofErr w:type="spellEnd"/>
-            <w:r>
-              <w:rPr>
-                <w:shd w:val="clear" w:color="auto" w:fill="FFFFFF"/>
-              </w:rPr>
-              <w:t xml:space="preserve"> }}</w:t>
+              <w:t>{{ fill_modify_step.subject }}</w:t>
             </w:r>
           </w:p>
         </w:tc>
@@ -1961,14 +1822,12 @@
               </w:rPr>
               <w:t xml:space="preserve">{{ </w:t>
             </w:r>
-            <w:proofErr w:type="spellStart"/>
             <w:r>
               <w:t>calculate_child_support_</w:t>
             </w:r>
             <w:r>
               <w:t>step.subject</w:t>
             </w:r>
-            <w:proofErr w:type="spellEnd"/>
             <w:r>
               <w:rPr>
                 <w:shd w:val="clear" w:color="auto" w:fill="FFFFFF"/>
@@ -2037,10 +1896,14 @@
               <w:t xml:space="preserve">{{ </w:t>
             </w:r>
             <w:r>
-              <w:t>dont_wait_modify_</w:t>
-            </w:r>
-            <w:r>
-              <w:t>child_support_step.subject }}</w:t>
+              <w:t>dont_wait_modify_custody_divorce_step</w:t>
+            </w:r>
+            <w:r>
+              <w:t xml:space="preserve">.subject </w:t>
+            </w:r>
+            <w:r>
+              <w:lastRenderedPageBreak/>
+              <w:t>}}</w:t>
             </w:r>
           </w:p>
         </w:tc>
@@ -2071,10 +1934,7 @@
               <w:t>{{p (include_docx_template("docassemble.AKA2JBranding:</w:t>
             </w:r>
             <w:r>
-              <w:t>dont_wait_modify</w:t>
-            </w:r>
-            <w:r>
-              <w:t>_child_support</w:t>
+              <w:t>dont_wait_modify_custody_divorce</w:t>
             </w:r>
             <w:r>
               <w:t>_content.docx")) }}</w:t>
@@ -2104,7 +1964,6 @@
               <w:rPr>
                 <w:shd w:val="clear" w:color="auto" w:fill="FFFFFF"/>
               </w:rPr>
-              <w:lastRenderedPageBreak/>
               <w:t>{%tr endif %}</w:t>
             </w:r>
           </w:p>
@@ -2169,21 +2028,8 @@
             <w:pPr>
               <w:pStyle w:val="Body"/>
             </w:pPr>
-            <w:proofErr w:type="spellStart"/>
-            <w:r>
-              <w:t>learn_reconsider_step</w:t>
-            </w:r>
-            <w:proofErr w:type="spellEnd"/>
-            <w:r>
-              <w:t xml:space="preserve"> and </w:t>
-            </w:r>
-            <w:proofErr w:type="spellStart"/>
-            <w:r>
-              <w:t>fill_reconsider_step</w:t>
-            </w:r>
-            <w:proofErr w:type="spellEnd"/>
-            <w:r>
-              <w:t xml:space="preserve"> in aka2j_mod_cust_div_templates.yml</w:t>
+            <w:r>
+              <w:t>learn_reconsider_step and fill_reconsider_step in aka2j_mod_cust_div_templates.yml</w:t>
             </w:r>
           </w:p>
         </w:tc>
@@ -2210,16 +2056,11 @@
             <w:r>
               <w:t xml:space="preserve">{{ </w:t>
             </w:r>
-            <w:proofErr w:type="spellStart"/>
             <w:r>
               <w:t>learn_reconsider_step</w:t>
             </w:r>
             <w:r>
-              <w:t>.subject</w:t>
-            </w:r>
-            <w:proofErr w:type="spellEnd"/>
-            <w:r>
-              <w:t xml:space="preserve"> }}</w:t>
+              <w:t>.subject }}</w:t>
             </w:r>
           </w:p>
         </w:tc>
@@ -2278,21 +2119,13 @@
               <w:outlineLvl w:val="1"/>
             </w:pPr>
             <w:r>
-              <w:t xml:space="preserve">{{ </w:t>
-            </w:r>
-            <w:proofErr w:type="spellStart"/>
-            <w:r>
-              <w:t>fill</w:t>
+              <w:t>{{ fill</w:t>
             </w:r>
             <w:r>
               <w:t>_reconsider_step</w:t>
             </w:r>
             <w:r>
-              <w:t>.subject</w:t>
-            </w:r>
-            <w:proofErr w:type="spellEnd"/>
-            <w:r>
-              <w:t xml:space="preserve"> }}</w:t>
+              <w:t>.subject }}</w:t>
             </w:r>
           </w:p>
         </w:tc>
@@ -2420,13 +2253,8 @@
             <w:pPr>
               <w:pStyle w:val="Body"/>
             </w:pPr>
-            <w:proofErr w:type="spellStart"/>
-            <w:r>
-              <w:t>standing_order_step</w:t>
-            </w:r>
-            <w:proofErr w:type="spellEnd"/>
-            <w:r>
-              <w:t xml:space="preserve"> and </w:t>
+            <w:r>
+              <w:t xml:space="preserve">standing_order_step and </w:t>
             </w:r>
             <w:r>
               <w:rPr>
@@ -2525,14 +2353,8 @@
               <w:rPr>
                 <w:shd w:val="clear" w:color="auto" w:fill="FFFFFF"/>
               </w:rPr>
-              <w:t>{{ motion_forms_st</w:t>
-            </w:r>
-            <w:r>
-              <w:rPr>
-                <w:shd w:val="clear" w:color="auto" w:fill="FFFFFF"/>
-              </w:rPr>
               <w:lastRenderedPageBreak/>
-              <w:t>ep.subject }}</w:t>
+              <w:t>{{ motion_forms_step.subject }}</w:t>
             </w:r>
           </w:p>
         </w:tc>
@@ -2569,7 +2391,6 @@
               <w:t>motion_forms</w:t>
             </w:r>
             <w:r>
-              <w:lastRenderedPageBreak/>
               <w:t>_content.docx")) }}</w:t>
             </w:r>
           </w:p>
@@ -2597,7 +2418,6 @@
               <w:rPr>
                 <w:shd w:val="clear" w:color="auto" w:fill="FFFFFF"/>
               </w:rPr>
-              <w:lastRenderedPageBreak/>
               <w:t>{%tr endif %}</w:t>
             </w:r>
           </w:p>
@@ -2860,7 +2680,14 @@
               <w:rPr>
                 <w:shd w:val="clear" w:color="auto" w:fill="FFFFFF"/>
               </w:rPr>
-              <w:t>{{ learn_set_aside_step.subject }}</w:t>
+              <w:t>{{ learn_set_aside</w:t>
+            </w:r>
+            <w:r>
+              <w:rPr>
+                <w:shd w:val="clear" w:color="auto" w:fill="FFFFFF"/>
+              </w:rPr>
+              <w:lastRenderedPageBreak/>
+              <w:t>_step.subject }}</w:t>
             </w:r>
           </w:p>
         </w:tc>
@@ -2894,7 +2721,11 @@
               <w:t xml:space="preserve"> (include_docx_template("docassemble.AKA2JBranding:</w:t>
             </w:r>
             <w:r>
-              <w:t>learn_set_aside</w:t>
+              <w:t>learn_set_asid</w:t>
+            </w:r>
+            <w:r>
+              <w:lastRenderedPageBreak/>
+              <w:t>e</w:t>
             </w:r>
             <w:r>
               <w:t>_content.docx")) }}</w:t>
@@ -3376,6 +3207,7 @@
               <w:rPr>
                 <w:shd w:val="clear" w:color="auto" w:fill="FFFFFF"/>
               </w:rPr>
+              <w:lastRenderedPageBreak/>
               <w:t>{%tr endif %}</w:t>
             </w:r>
           </w:p>
@@ -3425,7 +3257,6 @@
               <w:rPr>
                 <w:shd w:val="clear" w:color="auto" w:fill="FFFFFF"/>
               </w:rPr>
-              <w:lastRenderedPageBreak/>
               <w:t>{%tr if type_of_response in('modify', 'set aside') %}</w:t>
             </w:r>
           </w:p>
@@ -3863,6 +3694,7 @@
               <w:rPr>
                 <w:shd w:val="clear" w:color="auto" w:fill="FFFFFF"/>
               </w:rPr>
+              <w:lastRenderedPageBreak/>
               <w:t>{%tr endif %}</w:t>
             </w:r>
           </w:p>
@@ -3912,7 +3744,6 @@
               <w:rPr>
                 <w:shd w:val="clear" w:color="auto" w:fill="FFFFFF"/>
               </w:rPr>
-              <w:lastRenderedPageBreak/>
               <w:t>{%tr if user_need == 'change foreign custody order' or (user_need in('change custody order', 'change divorce order') and not unknown_final_date.all_true('appeal', exclusive = True))</w:t>
             </w:r>
             <w:r>
@@ -3949,13 +3780,8 @@
                 <w:shd w:val="clear" w:color="auto" w:fill="FFFFFF"/>
               </w:rPr>
             </w:pPr>
-            <w:proofErr w:type="spellStart"/>
-            <w:r>
-              <w:t>file_motion_step</w:t>
-            </w:r>
-            <w:proofErr w:type="spellEnd"/>
-            <w:r>
-              <w:t xml:space="preserve"> aka2j_templates.yml</w:t>
+            <w:r>
+              <w:t>file_motion_step aka2j_templates.yml</w:t>
             </w:r>
           </w:p>
         </w:tc>
@@ -4145,21 +3971,12 @@
                 <w:color w:val="FF00FF"/>
               </w:rPr>
             </w:pPr>
-            <w:proofErr w:type="spellStart"/>
             <w:r>
               <w:rPr>
                 <w:rFonts w:eastAsia="Calibri"/>
                 <w:strike/>
               </w:rPr>
-              <w:t>file_response_step</w:t>
-            </w:r>
-            <w:proofErr w:type="spellEnd"/>
-            <w:r>
-              <w:rPr>
-                <w:rFonts w:eastAsia="Calibri"/>
-                <w:strike/>
-              </w:rPr>
-              <w:t xml:space="preserve"> in aka2j_motion_response_templates.yml</w:t>
+              <w:t>file_response_step in aka2j_motion_response_templates.yml</w:t>
             </w:r>
             <w:r>
               <w:rPr>
@@ -4300,14 +4117,14 @@
               <w:rPr>
                 <w:shd w:val="clear" w:color="auto" w:fill="FFFFFF"/>
               </w:rPr>
-              <w:t>user_need in('change custody order', 'change divorce order') and not unknown_final_date.all_t</w:t>
+              <w:t xml:space="preserve">user_need in('change custody </w:t>
             </w:r>
             <w:r>
               <w:rPr>
                 <w:shd w:val="clear" w:color="auto" w:fill="FFFFFF"/>
               </w:rPr>
               <w:lastRenderedPageBreak/>
-              <w:t>rue</w:t>
+              <w:t>order', 'change divorce order') and not unknown_final_date.all_true</w:t>
             </w:r>
             <w:r>
               <w:rPr>
@@ -4361,14 +4178,9 @@
             <w:pPr>
               <w:pStyle w:val="Body"/>
             </w:pPr>
-            <w:proofErr w:type="spellStart"/>
             <w:r>
               <w:lastRenderedPageBreak/>
-              <w:t>serve_motion_response_step</w:t>
-            </w:r>
-            <w:proofErr w:type="spellEnd"/>
-            <w:r>
-              <w:t xml:space="preserve"> in aka2j_motion_response_templates.yml</w:t>
+              <w:t>serve_motion_response_step in aka2j_motion_response_templates.yml</w:t>
             </w:r>
           </w:p>
         </w:tc>
@@ -4559,13 +4371,8 @@
               </w:rPr>
               <w:t>(</w:t>
             </w:r>
-            <w:proofErr w:type="spellStart"/>
-            <w:r>
-              <w:t>unknown_final_date.true_values</w:t>
-            </w:r>
-            <w:proofErr w:type="spellEnd"/>
-            <w:r>
-              <w:t>()</w:t>
+            <w:r>
+              <w:t>unknown_final_date.true_values()</w:t>
             </w:r>
             <w:r>
               <w:rPr>
@@ -4574,15 +4381,7 @@
               <w:t>)</w:t>
             </w:r>
             <w:r>
-              <w:t>|</w:t>
-            </w:r>
-            <w:proofErr w:type="spellStart"/>
-            <w:r>
-              <w:t>list|length</w:t>
-            </w:r>
-            <w:proofErr w:type="spellEnd"/>
-            <w:r>
-              <w:t xml:space="preserve"> == 1 </w:t>
+              <w:t xml:space="preserve">|list|length == 1 </w:t>
             </w:r>
             <w:r>
               <w:rPr>
@@ -4626,13 +4425,8 @@
               </w:rPr>
               <w:t>(</w:t>
             </w:r>
-            <w:proofErr w:type="spellStart"/>
-            <w:r>
-              <w:t>unknown_final_date.true_values</w:t>
-            </w:r>
-            <w:proofErr w:type="spellEnd"/>
-            <w:r>
-              <w:t>()</w:t>
+            <w:r>
+              <w:t>unknown_final_date.true_values()</w:t>
             </w:r>
             <w:r>
               <w:rPr>
@@ -4641,15 +4435,7 @@
               <w:t>)</w:t>
             </w:r>
             <w:r>
-              <w:t>|</w:t>
-            </w:r>
-            <w:proofErr w:type="spellStart"/>
-            <w:r>
-              <w:t>list|length</w:t>
-            </w:r>
-            <w:proofErr w:type="spellEnd"/>
-            <w:r>
-              <w:t xml:space="preserve"> &gt;= 2 </w:t>
+              <w:t xml:space="preserve">|list|length &gt;= 2 </w:t>
             </w:r>
             <w:r>
               <w:rPr>
@@ -4658,7 +4444,11 @@
               <w:t>and</w:t>
             </w:r>
             <w:r>
-              <w:t xml:space="preserve"> unknown_final_date['set aside']</w:t>
+              <w:t xml:space="preserve"> unknown_final_date['set </w:t>
+            </w:r>
+            <w:r>
+              <w:lastRenderedPageBreak/>
+              <w:t>aside']</w:t>
             </w:r>
             <w:r>
               <w:rPr>
@@ -4694,13 +4484,9 @@
             <w:pPr>
               <w:pStyle w:val="Body"/>
             </w:pPr>
-            <w:proofErr w:type="spellStart"/>
-            <w:r>
-              <w:t>expect_after_motion_step</w:t>
-            </w:r>
-            <w:proofErr w:type="spellEnd"/>
-            <w:r>
-              <w:t xml:space="preserve"> in aka2j_mod_cust_div_templates.yml</w:t>
+            <w:r>
+              <w:lastRenderedPageBreak/>
+              <w:t>expect_after_motion_step in aka2j_mod_cust_div_templates.yml</w:t>
             </w:r>
           </w:p>
         </w:tc>
@@ -4731,19 +4517,13 @@
               <w:rPr>
                 <w:shd w:val="clear" w:color="auto" w:fill="FFFFFF"/>
               </w:rPr>
-              <w:lastRenderedPageBreak/>
               <w:t xml:space="preserve">{{ </w:t>
             </w:r>
-            <w:proofErr w:type="spellStart"/>
             <w:r>
               <w:t>expect_after_motion_or_answer</w:t>
             </w:r>
             <w:r>
-              <w:t>_step.subject</w:t>
-            </w:r>
-            <w:proofErr w:type="spellEnd"/>
-            <w:r>
-              <w:t xml:space="preserve"> }}</w:t>
+              <w:t>_step.subject }}</w:t>
             </w:r>
           </w:p>
         </w:tc>
@@ -4886,19 +4666,11 @@
                 <w:rFonts w:eastAsia="Calibri"/>
               </w:rPr>
             </w:pPr>
-            <w:proofErr w:type="spellStart"/>
             <w:r>
               <w:rPr>
                 <w:rFonts w:eastAsia="Calibri"/>
               </w:rPr>
-              <w:t>expect_reconsider_step</w:t>
-            </w:r>
-            <w:proofErr w:type="spellEnd"/>
-            <w:r>
-              <w:rPr>
-                <w:rFonts w:eastAsia="Calibri"/>
-              </w:rPr>
-              <w:t xml:space="preserve"> in aka2j_mod_cust_div_templates.yml</w:t>
+              <w:t>expect_reconsider_step in aka2j_mod_cust_div_templates.yml</w:t>
             </w:r>
           </w:p>
         </w:tc>
@@ -4925,16 +4697,11 @@
             <w:r>
               <w:t xml:space="preserve">{{ </w:t>
             </w:r>
-            <w:proofErr w:type="spellStart"/>
             <w:r>
               <w:t>expect_reconsider_step</w:t>
             </w:r>
             <w:r>
-              <w:t>.subject</w:t>
-            </w:r>
-            <w:proofErr w:type="spellEnd"/>
-            <w:r>
-              <w:t xml:space="preserve"> }}</w:t>
+              <w:t>.subject }}</w:t>
             </w:r>
           </w:p>
         </w:tc>
@@ -5096,21 +4863,12 @@
                 <w:rFonts w:eastAsia="Calibri"/>
               </w:rPr>
             </w:pPr>
-            <w:proofErr w:type="spellStart"/>
             <w:r>
               <w:rPr>
                 <w:rFonts w:eastAsia="Calibri"/>
                 <w:shd w:val="clear" w:color="auto" w:fill="FFFFFF"/>
               </w:rPr>
-              <w:t>expect_after_response_step</w:t>
-            </w:r>
-            <w:proofErr w:type="spellEnd"/>
-            <w:r>
-              <w:rPr>
-                <w:rFonts w:eastAsia="Calibri"/>
-                <w:shd w:val="clear" w:color="auto" w:fill="FFFFFF"/>
-              </w:rPr>
-              <w:t xml:space="preserve"> in aka2j_motion_response_templates.yml</w:t>
+              <w:t>expect_after_response_step in aka2j_motion_response_templates.yml</w:t>
             </w:r>
           </w:p>
         </w:tc>
@@ -5143,25 +4901,24 @@
               </w:rPr>
               <w:t xml:space="preserve">{{ </w:t>
             </w:r>
-            <w:proofErr w:type="spellStart"/>
-            <w:r>
-              <w:rPr>
-                <w:shd w:val="clear" w:color="auto" w:fill="FFFFFF"/>
-              </w:rPr>
-              <w:t>expect_after_response_step</w:t>
-            </w:r>
-            <w:r>
-              <w:rPr>
-                <w:shd w:val="clear" w:color="auto" w:fill="FFFFFF"/>
-              </w:rPr>
-              <w:t>.subject</w:t>
-            </w:r>
-            <w:proofErr w:type="spellEnd"/>
-            <w:r>
-              <w:rPr>
-                <w:shd w:val="clear" w:color="auto" w:fill="FFFFFF"/>
-              </w:rPr>
-              <w:t xml:space="preserve"> }}</w:t>
+            <w:r>
+              <w:rPr>
+                <w:shd w:val="clear" w:color="auto" w:fill="FFFFFF"/>
+              </w:rPr>
+              <w:t>expect_after_res</w:t>
+            </w:r>
+            <w:r>
+              <w:rPr>
+                <w:shd w:val="clear" w:color="auto" w:fill="FFFFFF"/>
+              </w:rPr>
+              <w:lastRenderedPageBreak/>
+              <w:t>ponse_step</w:t>
+            </w:r>
+            <w:r>
+              <w:rPr>
+                <w:shd w:val="clear" w:color="auto" w:fill="FFFFFF"/>
+              </w:rPr>
+              <w:t>.subject }}</w:t>
             </w:r>
           </w:p>
         </w:tc>
@@ -5204,7 +4961,14 @@
               <w:rPr>
                 <w:shd w:val="clear" w:color="auto" w:fill="FFFFFF"/>
               </w:rPr>
-              <w:t>response</w:t>
+              <w:t>r</w:t>
+            </w:r>
+            <w:r>
+              <w:rPr>
+                <w:shd w:val="clear" w:color="auto" w:fill="FFFFFF"/>
+              </w:rPr>
+              <w:lastRenderedPageBreak/>
+              <w:t>esponse</w:t>
             </w:r>
             <w:r>
               <w:t>_content.docx")) }}</w:t>
@@ -5311,19 +5075,23 @@
                 <w:rFonts w:eastAsia="Calibri"/>
               </w:rPr>
             </w:pPr>
-            <w:proofErr w:type="spellStart"/>
             <w:r>
               <w:rPr>
                 <w:rFonts w:eastAsia="Calibri"/>
               </w:rPr>
-              <w:t>contact_other_party_stepand</w:t>
-            </w:r>
-            <w:proofErr w:type="spellEnd"/>
+              <w:t>contact_other_party_step</w:t>
+            </w:r>
             <w:r>
               <w:rPr>
                 <w:rFonts w:eastAsia="Calibri"/>
               </w:rPr>
-              <w:t xml:space="preserve"> file_agreement_step in aka2j_motion_response_templates.yml</w:t>
+              <w:t xml:space="preserve"> </w:t>
+            </w:r>
+            <w:r>
+              <w:rPr>
+                <w:rFonts w:eastAsia="Calibri"/>
+              </w:rPr>
+              <w:t>and file_agreement_step in aka2j_motion_response_templates.yml</w:t>
             </w:r>
           </w:p>
         </w:tc>
@@ -5356,20 +5124,12 @@
               </w:rPr>
               <w:t xml:space="preserve">{{ </w:t>
             </w:r>
-            <w:proofErr w:type="spellStart"/>
             <w:r>
               <w:rPr>
                 <w:rFonts w:eastAsia="Calibri"/>
               </w:rPr>
-              <w:t>contact_other_party</w:t>
-            </w:r>
-            <w:r>
-              <w:rPr>
-                <w:rFonts w:eastAsia="Calibri"/>
-              </w:rPr>
-              <w:t>_step.subject</w:t>
-            </w:r>
-            <w:proofErr w:type="spellEnd"/>
+              <w:t>contact_other_party_step.subject</w:t>
+            </w:r>
             <w:r>
               <w:rPr>
                 <w:shd w:val="clear" w:color="auto" w:fill="FFFFFF"/>
@@ -5564,21 +5324,19 @@
               <w:rPr>
                 <w:shd w:val="clear" w:color="auto" w:fill="FFFFFF"/>
               </w:rPr>
-              <w:t>{%tr if respond_to_appeal in ('</w:t>
-            </w:r>
-            <w:proofErr w:type="spellStart"/>
-            <w:r>
-              <w:rPr>
-                <w:shd w:val="clear" w:color="auto" w:fill="FFFFFF"/>
-              </w:rPr>
-              <w:t>agree','some</w:t>
-            </w:r>
-            <w:proofErr w:type="spellEnd"/>
-            <w:r>
-              <w:rPr>
-                <w:shd w:val="clear" w:color="auto" w:fill="FFFFFF"/>
-              </w:rPr>
-              <w:t>', 'none') %}</w:t>
+              <w:t>{%tr if respond_to_appeal in ('agree',</w:t>
+            </w:r>
+            <w:r>
+              <w:rPr>
+                <w:shd w:val="clear" w:color="auto" w:fill="FFFFFF"/>
+              </w:rPr>
+              <w:t xml:space="preserve"> </w:t>
+            </w:r>
+            <w:r>
+              <w:rPr>
+                <w:shd w:val="clear" w:color="auto" w:fill="FFFFFF"/>
+              </w:rPr>
+              <w:t>'some', 'none') %}</w:t>
             </w:r>
           </w:p>
         </w:tc>
@@ -5602,19 +5360,11 @@
                 <w:rFonts w:eastAsia="Calibri"/>
               </w:rPr>
             </w:pPr>
-            <w:proofErr w:type="spellStart"/>
             <w:r>
               <w:rPr>
                 <w:rFonts w:eastAsia="Calibri"/>
               </w:rPr>
-              <w:t>appeal_response_step</w:t>
-            </w:r>
-            <w:proofErr w:type="spellEnd"/>
-            <w:r>
-              <w:rPr>
-                <w:rFonts w:eastAsia="Calibri"/>
-              </w:rPr>
-              <w:t xml:space="preserve"> in aka2j_motion_response_templates.yml</w:t>
+              <w:t>appeal_response_step in aka2j_motion_response_templates.yml</w:t>
             </w:r>
           </w:p>
         </w:tc>
@@ -5645,7 +5395,14 @@
               <w:rPr>
                 <w:shd w:val="clear" w:color="auto" w:fill="FFFFFF"/>
               </w:rPr>
-              <w:t>{{ appeal_response_step.subject }}</w:t>
+              <w:t>{{ appeal_respons</w:t>
+            </w:r>
+            <w:r>
+              <w:rPr>
+                <w:shd w:val="clear" w:color="auto" w:fill="FFFFFF"/>
+              </w:rPr>
+              <w:lastRenderedPageBreak/>
+              <w:t>e_step.subject }}</w:t>
             </w:r>
           </w:p>
         </w:tc>
@@ -5682,7 +5439,14 @@
               <w:rPr>
                 <w:shd w:val="clear" w:color="auto" w:fill="FFFFFF"/>
               </w:rPr>
-              <w:t>appeal_response</w:t>
+              <w:t>appeal_respo</w:t>
+            </w:r>
+            <w:r>
+              <w:rPr>
+                <w:shd w:val="clear" w:color="auto" w:fill="FFFFFF"/>
+              </w:rPr>
+              <w:lastRenderedPageBreak/>
+              <w:t>nse</w:t>
             </w:r>
             <w:r>
               <w:t>_content.docx")) }}</w:t>
@@ -5824,45 +5588,19 @@
               <w:rPr>
                 <w:shd w:val="clear" w:color="auto" w:fill="FFFFFF"/>
               </w:rPr>
-              <w:t xml:space="preserve">Step </w:t>
-            </w:r>
-            <w:bookmarkStart w:id="1" w:name="AppealContactParent"/>
-            <w:r>
-              <w:rPr>
-                <w:shd w:val="clear" w:color="auto" w:fill="FFFFFF"/>
-              </w:rPr>
-              <w:fldChar w:fldCharType="begin"/>
-            </w:r>
-            <w:r>
-              <w:rPr>
-                <w:shd w:val="clear" w:color="auto" w:fill="FFFFFF"/>
-              </w:rPr>
-              <w:instrText xml:space="preserve"> SEQ stepList \* ARABIC </w:instrText>
-            </w:r>
-            <w:r>
-              <w:rPr>
-                <w:shd w:val="clear" w:color="auto" w:fill="FFFFFF"/>
-              </w:rPr>
-              <w:fldChar w:fldCharType="separate"/>
-            </w:r>
-            <w:r>
-              <w:rPr>
-                <w:shd w:val="clear" w:color="auto" w:fill="FFFFFF"/>
-              </w:rPr>
-              <w:t>31</w:t>
-            </w:r>
-            <w:r>
-              <w:rPr>
-                <w:shd w:val="clear" w:color="auto" w:fill="FFFFFF"/>
-              </w:rPr>
-              <w:fldChar w:fldCharType="end"/>
-            </w:r>
-            <w:bookmarkEnd w:id="1"/>
-            <w:r>
-              <w:rPr>
-                <w:shd w:val="clear" w:color="auto" w:fill="FFFFFF"/>
-              </w:rPr>
-              <w:t>: Contact {{ other_party_in_case }}</w:t>
+              <w:t xml:space="preserve">{{ </w:t>
+            </w:r>
+            <w:r>
+              <w:t>appeal_contact_parent_step</w:t>
+            </w:r>
+            <w:r>
+              <w:t>.subject</w:t>
+            </w:r>
+            <w:r>
+              <w:rPr>
+                <w:shd w:val="clear" w:color="auto" w:fill="FFFFFF"/>
+              </w:rPr>
+              <w:t xml:space="preserve"> }}</w:t>
             </w:r>
           </w:p>
         </w:tc>
@@ -5935,14 +5673,12 @@
               </w:rPr>
               <w:t xml:space="preserve">{{ </w:t>
             </w:r>
-            <w:proofErr w:type="spellStart"/>
             <w:r>
               <w:t>tell_supreme_court_step</w:t>
             </w:r>
             <w:r>
               <w:t>.subject</w:t>
             </w:r>
-            <w:proofErr w:type="spellEnd"/>
             <w:r>
               <w:rPr>
                 <w:shd w:val="clear" w:color="auto" w:fill="FFFFFF"/>
@@ -6044,19 +5780,11 @@
                 <w:rFonts w:eastAsia="Calibri"/>
               </w:rPr>
             </w:pPr>
-            <w:proofErr w:type="spellStart"/>
             <w:r>
               <w:rPr>
                 <w:rFonts w:eastAsia="Calibri"/>
               </w:rPr>
-              <w:t>get_help</w:t>
-            </w:r>
-            <w:proofErr w:type="spellEnd"/>
-            <w:r>
-              <w:rPr>
-                <w:rFonts w:eastAsia="Calibri"/>
-              </w:rPr>
-              <w:t xml:space="preserve"> in aka2j_templates.yml</w:t>
+              <w:t>get_help in aka2j_templates.yml</w:t>
             </w:r>
           </w:p>
         </w:tc>
@@ -6081,15 +5809,7 @@
               <w:outlineLvl w:val="1"/>
             </w:pPr>
             <w:r>
-              <w:t xml:space="preserve">{{ </w:t>
-            </w:r>
-            <w:proofErr w:type="spellStart"/>
-            <w:r>
-              <w:t>get_help.subject</w:t>
-            </w:r>
-            <w:proofErr w:type="spellEnd"/>
-            <w:r>
-              <w:t xml:space="preserve"> }}</w:t>
+              <w:t>{{ get_help.subject }}</w:t>
             </w:r>
           </w:p>
         </w:tc>
@@ -6213,14 +5933,27 @@
     <w:r>
       <w:t xml:space="preserve"> of </w:t>
     </w:r>
-    <w:fldSimple w:instr=" NUMPAGES \* ARABIC ">
-      <w:r>
-        <w:rPr>
-          <w:noProof/>
-        </w:rPr>
-        <w:t>50</w:t>
-      </w:r>
-    </w:fldSimple>
+    <w:r>
+      <w:fldChar w:fldCharType="begin"/>
+    </w:r>
+    <w:r>
+      <w:instrText xml:space="preserve"> NUMPAGES \* ARABIC </w:instrText>
+    </w:r>
+    <w:r>
+      <w:fldChar w:fldCharType="separate"/>
+    </w:r>
+    <w:r>
+      <w:rPr>
+        <w:noProof/>
+      </w:rPr>
+      <w:t>50</w:t>
+    </w:r>
+    <w:r>
+      <w:rPr>
+        <w:noProof/>
+      </w:rPr>
+      <w:fldChar w:fldCharType="end"/>
+    </w:r>
     <w:r>
       <w:t xml:space="preserve"> pages</w:t>
     </w:r>
@@ -6237,7 +5970,7 @@
       <w:t>1</w:t>
     </w:r>
     <w:r>
-      <w:t>6</w:t>
+      <w:t>7</w:t>
     </w:r>
     <w:r>
       <w:t>, 202</w:t>
@@ -6275,11 +6008,21 @@
     <w:r>
       <w:t xml:space="preserve"> of </w:t>
     </w:r>
-    <w:fldSimple w:instr=" NUMPAGES \* ARABIC ">
-      <w:r>
-        <w:t>47</w:t>
-      </w:r>
-    </w:fldSimple>
+    <w:r>
+      <w:fldChar w:fldCharType="begin"/>
+    </w:r>
+    <w:r>
+      <w:instrText xml:space="preserve"> NUMPAGES \* ARABIC </w:instrText>
+    </w:r>
+    <w:r>
+      <w:fldChar w:fldCharType="separate"/>
+    </w:r>
+    <w:r>
+      <w:t>47</w:t>
+    </w:r>
+    <w:r>
+      <w:fldChar w:fldCharType="end"/>
+    </w:r>
     <w:r>
       <w:t xml:space="preserve"> pages</w:t>
     </w:r>

</xml_diff>

<commit_message>
So weird Rows 44 and 44b in more than 15  tests were passing on GH not passing on dev. I only noticed because docx Action Plan was not getting steps for Set Aside. once I fixed the issue on dev server asking unknown_final_date, Now docx is working. So weird
</commit_message>
<xml_diff>
--- a/docassemble/ChangingChildCustody/data/templates/changing_child_custody_action_plan.docx
+++ b/docassemble/ChangingChildCustody/data/templates/changing_child_custody_action_plan.docx
@@ -2628,9 +2628,141 @@
           <w:p>
             <w:pPr>
               <w:pStyle w:val="Body"/>
-            </w:pPr>
-            <w:r>
-              <w:t>{%tr if user_need == "change custody order" and why_change == 'problem' and not final_order_date_within_10_days and (not defined('unknown_final_date') or unknown_final_date['set aside']) %}</w:t>
+              <w:rPr>
+                <w:sz w:val="26"/>
+                <w:szCs w:val="26"/>
+              </w:rPr>
+            </w:pPr>
+            <w:r>
+              <w:t xml:space="preserve">{%tr if user_need == </w:t>
+            </w:r>
+            <w:r>
+              <w:t>‘</w:t>
+            </w:r>
+            <w:r>
+              <w:t>change custody order</w:t>
+            </w:r>
+            <w:r>
+              <w:t xml:space="preserve">’ </w:t>
+            </w:r>
+            <w:r>
+              <w:t xml:space="preserve">and </w:t>
+            </w:r>
+            <w:r>
+              <w:rPr>
+                <w:color w:val="E056D6"/>
+              </w:rPr>
+              <w:t xml:space="preserve">middle_of_case == 'no' </w:t>
+            </w:r>
+            <w:r>
+              <w:t xml:space="preserve">and why_change == 'problem' and </w:t>
+            </w:r>
+            <w:r>
+              <w:rPr>
+                <w:color w:val="E056D6"/>
+              </w:rPr>
+              <w:t>(</w:t>
+            </w:r>
+            <w:r>
+              <w:t>final_order_date_within_1</w:t>
+            </w:r>
+            <w:r>
+              <w:t>5</w:t>
+            </w:r>
+            <w:r>
+              <w:t>_days</w:t>
+            </w:r>
+            <w:r>
+              <w:t xml:space="preserve"> </w:t>
+            </w:r>
+            <w:r>
+              <w:rPr>
+                <w:color w:val="E056D6"/>
+              </w:rPr>
+              <w:t>or</w:t>
+            </w:r>
+            <w:r>
+              <w:rPr>
+                <w:color w:val="E056D6"/>
+              </w:rPr>
+              <w:t xml:space="preserve"> (</w:t>
+            </w:r>
+            <w:r>
+              <w:rPr>
+                <w:color w:val="E056D6"/>
+              </w:rPr>
+              <w:t>defined('final_order_period') and guess_final_order_date != 'unknown'</w:t>
+            </w:r>
+            <w:r>
+              <w:rPr>
+                <w:color w:val="E056D6"/>
+              </w:rPr>
+              <w:t>) or (</w:t>
+            </w:r>
+            <w:r>
+              <w:rPr>
+                <w:color w:val="E056D6"/>
+              </w:rPr>
+              <w:t xml:space="preserve">final_order_date != '' and date_difference(starting=final_order_date, </w:t>
+            </w:r>
+            <w:r>
+              <w:rPr>
+                <w:color w:val="E056D6"/>
+              </w:rPr>
+              <w:lastRenderedPageBreak/>
+              <w:t>ending=today()).days &gt; 15</w:t>
+            </w:r>
+            <w:r>
+              <w:rPr>
+                <w:color w:val="E056D6"/>
+              </w:rPr>
+              <w:t>)</w:t>
+            </w:r>
+            <w:r>
+              <w:rPr>
+                <w:color w:val="E056D6"/>
+              </w:rPr>
+              <w:t xml:space="preserve"> or (</w:t>
+            </w:r>
+            <w:r>
+              <w:rPr>
+                <w:color w:val="E056D6"/>
+              </w:rPr>
+              <w:t>defined('final_order_period') and guess_final_order_date == 'unknown'</w:t>
+            </w:r>
+            <w:r>
+              <w:rPr>
+                <w:color w:val="E056D6"/>
+              </w:rPr>
+              <w:t xml:space="preserve"> </w:t>
+            </w:r>
+            <w:r>
+              <w:rPr>
+                <w:color w:val="E056D6"/>
+              </w:rPr>
+              <w:t xml:space="preserve">and </w:t>
+            </w:r>
+            <w:r>
+              <w:rPr>
+                <w:color w:val="E056D6"/>
+              </w:rPr>
+              <w:t>unknown_final_date['set aside']</w:t>
+            </w:r>
+            <w:r>
+              <w:rPr>
+                <w:color w:val="E056D6"/>
+              </w:rPr>
+              <w:t>))</w:t>
+            </w:r>
+            <w:r>
+              <w:t xml:space="preserve"> %</w:t>
+            </w:r>
+            <w:r>
+              <w:rPr>
+                <w:sz w:val="26"/>
+                <w:szCs w:val="26"/>
+              </w:rPr>
+              <w:t>}</w:t>
             </w:r>
           </w:p>
         </w:tc>
@@ -2650,9 +2782,190 @@
           <w:p>
             <w:pPr>
               <w:pStyle w:val="Body"/>
-            </w:pPr>
-            <w:r>
+              <w:rPr>
+                <w:color w:val="E056D6"/>
+              </w:rPr>
+            </w:pPr>
+            <w:r>
+              <w:lastRenderedPageBreak/>
               <w:t>learn_set_aside_step and fill_set_aside_step in aka2j_mod_cust_div_templates.yml</w:t>
+            </w:r>
+            <w:r>
+              <w:br/>
+              <w:t xml:space="preserve"> </w:t>
+            </w:r>
+            <w:r>
+              <w:rPr>
+                <w:color w:val="E056D6"/>
+              </w:rPr>
+              <w:t>if middle_of_case == 'no' \</w:t>
+            </w:r>
+          </w:p>
+          <w:p>
+            <w:pPr>
+              <w:pStyle w:val="Body"/>
+              <w:rPr>
+                <w:color w:val="E056D6"/>
+              </w:rPr>
+            </w:pPr>
+            <w:r>
+              <w:rPr>
+                <w:color w:val="E056D6"/>
+              </w:rPr>
+              <w:t xml:space="preserve">      and why_change == 'problem' \</w:t>
+            </w:r>
+          </w:p>
+          <w:p>
+            <w:pPr>
+              <w:pStyle w:val="Body"/>
+              <w:rPr>
+                <w:color w:val="E056D6"/>
+              </w:rPr>
+            </w:pPr>
+            <w:r>
+              <w:rPr>
+                <w:color w:val="E056D6"/>
+              </w:rPr>
+              <w:t xml:space="preserve">      and final_order_date_within_15_days:</w:t>
+            </w:r>
+            <w:r>
+              <w:rPr>
+                <w:color w:val="E056D6"/>
+              </w:rPr>
+              <w:br/>
+            </w:r>
+            <w:r>
+              <w:rPr>
+                <w:color w:val="E056D6"/>
+              </w:rPr>
+              <w:br/>
+            </w:r>
+            <w:r>
+              <w:t xml:space="preserve"> </w:t>
+            </w:r>
+            <w:r>
+              <w:rPr>
+                <w:color w:val="E056D6"/>
+              </w:rPr>
+              <w:t>if (defined('final_order_period') \</w:t>
+            </w:r>
+          </w:p>
+          <w:p>
+            <w:pPr>
+              <w:pStyle w:val="Body"/>
+              <w:rPr>
+                <w:color w:val="E056D6"/>
+              </w:rPr>
+            </w:pPr>
+            <w:r>
+              <w:rPr>
+                <w:color w:val="E056D6"/>
+              </w:rPr>
+              <w:t xml:space="preserve">            and guess_final_order_date != 'unknown') \</w:t>
+            </w:r>
+          </w:p>
+          <w:p>
+            <w:pPr>
+              <w:pStyle w:val="Body"/>
+              <w:rPr>
+                <w:color w:val="E056D6"/>
+              </w:rPr>
+            </w:pPr>
+            <w:r>
+              <w:rPr>
+                <w:color w:val="E056D6"/>
+              </w:rPr>
+              <w:t xml:space="preserve">          or (final_order_date != '' \</w:t>
+            </w:r>
+          </w:p>
+          <w:p>
+            <w:pPr>
+              <w:pStyle w:val="Body"/>
+              <w:rPr>
+                <w:color w:val="E056D6"/>
+              </w:rPr>
+            </w:pPr>
+            <w:r>
+              <w:rPr>
+                <w:color w:val="E056D6"/>
+              </w:rPr>
+              <w:t xml:space="preserve">            and date_difference(starting=final_order_date, ending=today()).days &gt; 15)</w:t>
+            </w:r>
+            <w:r>
+              <w:rPr>
+                <w:color w:val="E056D6"/>
+              </w:rPr>
+              <w:br/>
+            </w:r>
+            <w:r>
+              <w:rPr>
+                <w:color w:val="E056D6"/>
+              </w:rPr>
+              <w:br/>
+            </w:r>
+            <w:r>
+              <w:rPr>
+                <w:color w:val="E056D6"/>
+              </w:rPr>
+              <w:br/>
+            </w:r>
+            <w:r>
+              <w:rPr>
+                <w:color w:val="E056D6"/>
+              </w:rPr>
+              <w:br/>
+            </w:r>
+            <w:r>
+              <w:rPr>
+                <w:color w:val="E056D6"/>
+              </w:rPr>
+              <w:lastRenderedPageBreak/>
+              <w:t xml:space="preserve">or </w:t>
+            </w:r>
+            <w:r>
+              <w:rPr>
+                <w:color w:val="E056D6"/>
+              </w:rPr>
+              <w:br/>
+            </w:r>
+            <w:r>
+              <w:t xml:space="preserve"> </w:t>
+            </w:r>
+            <w:r>
+              <w:rPr>
+                <w:color w:val="E056D6"/>
+              </w:rPr>
+              <w:t>if defined('final_order_period') \</w:t>
+            </w:r>
+          </w:p>
+          <w:p>
+            <w:pPr>
+              <w:pStyle w:val="Body"/>
+              <w:rPr>
+                <w:color w:val="E056D6"/>
+              </w:rPr>
+            </w:pPr>
+            <w:r>
+              <w:rPr>
+                <w:color w:val="E056D6"/>
+              </w:rPr>
+              <w:t xml:space="preserve">          and guess_final_order_date == 'unknown':</w:t>
+            </w:r>
+            <w:r>
+              <w:rPr>
+                <w:color w:val="E056D6"/>
+              </w:rPr>
+              <w:br/>
+              <w:t xml:space="preserve">and </w:t>
+            </w:r>
+            <w:r>
+              <w:t xml:space="preserve"> </w:t>
+            </w:r>
+            <w:r>
+              <w:rPr>
+                <w:color w:val="E056D6"/>
+              </w:rPr>
+              <w:t>unknown_final_date['set aside']</w:t>
             </w:r>
           </w:p>
         </w:tc>
@@ -2680,14 +2993,8 @@
               <w:rPr>
                 <w:shd w:val="clear" w:color="auto" w:fill="FFFFFF"/>
               </w:rPr>
-              <w:t>{{ learn_set_aside</w:t>
-            </w:r>
-            <w:r>
-              <w:rPr>
-                <w:shd w:val="clear" w:color="auto" w:fill="FFFFFF"/>
-              </w:rPr>
               <w:lastRenderedPageBreak/>
-              <w:t>_step.subject }}</w:t>
+              <w:t>{{ learn_set_aside_step.subject }}</w:t>
             </w:r>
           </w:p>
         </w:tc>
@@ -2721,11 +3028,7 @@
               <w:t xml:space="preserve"> (include_docx_template("docassemble.AKA2JBranding:</w:t>
             </w:r>
             <w:r>
-              <w:t>learn_set_asid</w:t>
-            </w:r>
-            <w:r>
-              <w:lastRenderedPageBreak/>
-              <w:t>e</w:t>
+              <w:t>learn_set_aside</w:t>
             </w:r>
             <w:r>
               <w:t>_content.docx")) }}</w:t>
@@ -2756,7 +3059,6 @@
               <w:rPr>
                 <w:shd w:val="clear" w:color="auto" w:fill="FFFFFF"/>
               </w:rPr>
-              <w:lastRenderedPageBreak/>
               <w:t>{{ fill_set_aside_step.subject }}</w:t>
             </w:r>
           </w:p>
@@ -3060,7 +3362,14 @@
               <w:rPr>
                 <w:shd w:val="clear" w:color="auto" w:fill="FFFFFF"/>
               </w:rPr>
-              <w:t>{%tr if respond_to_modify == 'agree' or respond_to_set_aside == 'agree'</w:t>
+              <w:t xml:space="preserve">{%tr if </w:t>
+            </w:r>
+            <w:r>
+              <w:rPr>
+                <w:shd w:val="clear" w:color="auto" w:fill="FFFFFF"/>
+              </w:rPr>
+              <w:lastRenderedPageBreak/>
+              <w:t>respond_to_modify == 'agree' or respond_to_set_aside == 'agree'</w:t>
             </w:r>
             <w:r>
               <w:rPr>
@@ -3094,7 +3403,12 @@
               <w:pStyle w:val="Body"/>
             </w:pPr>
             <w:r>
-              <w:t>let_court_party_know_you_agree_step in aka2j_motion_response_templates.yml</w:t>
+              <w:lastRenderedPageBreak/>
+              <w:t xml:space="preserve">let_court_party_know_you_agree_step in </w:t>
+            </w:r>
+            <w:r>
+              <w:lastRenderedPageBreak/>
+              <w:t>aka2j_motion_response_templates.yml</w:t>
             </w:r>
           </w:p>
         </w:tc>
@@ -3125,6 +3439,7 @@
               <w:rPr>
                 <w:shd w:val="clear" w:color="auto" w:fill="FFFFFF"/>
               </w:rPr>
+              <w:lastRenderedPageBreak/>
               <w:t xml:space="preserve">{{ </w:t>
             </w:r>
             <w:r>
@@ -3207,7 +3522,6 @@
               <w:rPr>
                 <w:shd w:val="clear" w:color="auto" w:fill="FFFFFF"/>
               </w:rPr>
-              <w:lastRenderedPageBreak/>
               <w:t>{%tr endif %}</w:t>
             </w:r>
           </w:p>
@@ -3501,7 +3815,14 @@
               <w:rPr>
                 <w:color w:val="auto"/>
               </w:rPr>
-              <w:t>('respond to motion in custody', 'respond to motion in divorce')</w:t>
+              <w:t xml:space="preserve">('respond to motion in </w:t>
+            </w:r>
+            <w:r>
+              <w:rPr>
+                <w:color w:val="auto"/>
+              </w:rPr>
+              <w:lastRenderedPageBreak/>
+              <w:t>custody', 'respond to motion in divorce')</w:t>
             </w:r>
             <w:r>
               <w:rPr>
@@ -3550,6 +3871,7 @@
               <w:pStyle w:val="Body"/>
             </w:pPr>
             <w:r>
+              <w:lastRenderedPageBreak/>
               <w:t>sign</w:t>
             </w:r>
             <w:r>
@@ -3694,7 +4016,6 @@
               <w:rPr>
                 <w:shd w:val="clear" w:color="auto" w:fill="FFFFFF"/>
               </w:rPr>
-              <w:lastRenderedPageBreak/>
               <w:t>{%tr endif %}</w:t>
             </w:r>
           </w:p>
@@ -3946,7 +4267,16 @@
                 <w:shd w:val="clear" w:color="auto" w:fill="FFFFFF"/>
               </w:rPr>
               <w:br/>
-              <w:t>type_of_response in('reconsider', 'modify', 'set aside')</w:t>
+              <w:t xml:space="preserve">type_of_response in('reconsider', 'modify', </w:t>
+            </w:r>
+            <w:r>
+              <w:rPr>
+                <w:strike/>
+                <w:color w:val="FF00FF"/>
+                <w:shd w:val="clear" w:color="auto" w:fill="FFFFFF"/>
+              </w:rPr>
+              <w:lastRenderedPageBreak/>
+              <w:t>'set aside')</w:t>
             </w:r>
           </w:p>
         </w:tc>
@@ -3976,6 +4306,7 @@
                 <w:rFonts w:eastAsia="Calibri"/>
                 <w:strike/>
               </w:rPr>
+              <w:lastRenderedPageBreak/>
               <w:t>file_response_step in aka2j_motion_response_templates.yml</w:t>
             </w:r>
             <w:r>
@@ -4117,14 +4448,7 @@
               <w:rPr>
                 <w:shd w:val="clear" w:color="auto" w:fill="FFFFFF"/>
               </w:rPr>
-              <w:t xml:space="preserve">user_need in('change custody </w:t>
-            </w:r>
-            <w:r>
-              <w:rPr>
-                <w:shd w:val="clear" w:color="auto" w:fill="FFFFFF"/>
-              </w:rPr>
-              <w:lastRenderedPageBreak/>
-              <w:t>order', 'change divorce order') and not unknown_final_date.all_true</w:t>
+              <w:t>user_need in('change custody order', 'change divorce order') and not unknown_final_date.all_true</w:t>
             </w:r>
             <w:r>
               <w:rPr>
@@ -4179,7 +4503,6 @@
               <w:pStyle w:val="Body"/>
             </w:pPr>
             <w:r>
-              <w:lastRenderedPageBreak/>
               <w:t>serve_motion_response_step in aka2j_motion_response_templates.yml</w:t>
             </w:r>
           </w:p>
@@ -4348,7 +4671,11 @@
               <w:t>) and (</w:t>
             </w:r>
             <w:r>
-              <w:t xml:space="preserve">not defined('unknown_final_date') </w:t>
+              <w:t>not defined('unknown_final_</w:t>
+            </w:r>
+            <w:r>
+              <w:lastRenderedPageBreak/>
+              <w:t xml:space="preserve">date') </w:t>
             </w:r>
             <w:r>
               <w:rPr>
@@ -4444,11 +4771,7 @@
               <w:t>and</w:t>
             </w:r>
             <w:r>
-              <w:t xml:space="preserve"> unknown_final_date['set </w:t>
-            </w:r>
-            <w:r>
-              <w:lastRenderedPageBreak/>
-              <w:t>aside']</w:t>
+              <w:t xml:space="preserve"> unknown_final_date['set aside']</w:t>
             </w:r>
             <w:r>
               <w:rPr>
@@ -4780,6 +5103,7 @@
               <w:rPr>
                 <w:shd w:val="clear" w:color="auto" w:fill="FFFFFF"/>
               </w:rPr>
+              <w:lastRenderedPageBreak/>
               <w:t>{%tr endif %}</w:t>
             </w:r>
           </w:p>
@@ -4905,14 +5229,7 @@
               <w:rPr>
                 <w:shd w:val="clear" w:color="auto" w:fill="FFFFFF"/>
               </w:rPr>
-              <w:t>expect_after_res</w:t>
-            </w:r>
-            <w:r>
-              <w:rPr>
-                <w:shd w:val="clear" w:color="auto" w:fill="FFFFFF"/>
-              </w:rPr>
-              <w:lastRenderedPageBreak/>
-              <w:t>ponse_step</w:t>
+              <w:t>expect_after_response_step</w:t>
             </w:r>
             <w:r>
               <w:rPr>
@@ -4961,14 +5278,7 @@
               <w:rPr>
                 <w:shd w:val="clear" w:color="auto" w:fill="FFFFFF"/>
               </w:rPr>
-              <w:t>r</w:t>
-            </w:r>
-            <w:r>
-              <w:rPr>
-                <w:shd w:val="clear" w:color="auto" w:fill="FFFFFF"/>
-              </w:rPr>
-              <w:lastRenderedPageBreak/>
-              <w:t>esponse</w:t>
+              <w:t>response</w:t>
             </w:r>
             <w:r>
               <w:t>_content.docx")) }}</w:t>
@@ -5001,7 +5311,6 @@
               <w:rPr>
                 <w:shd w:val="clear" w:color="auto" w:fill="FFFFFF"/>
               </w:rPr>
-              <w:lastRenderedPageBreak/>
               <w:t>{%tr endif %}</w:t>
             </w:r>
           </w:p>
@@ -5324,6 +5633,7 @@
               <w:rPr>
                 <w:shd w:val="clear" w:color="auto" w:fill="FFFFFF"/>
               </w:rPr>
+              <w:lastRenderedPageBreak/>
               <w:t>{%tr if respond_to_appeal in ('agree',</w:t>
             </w:r>
             <w:r>
@@ -5395,14 +5705,7 @@
               <w:rPr>
                 <w:shd w:val="clear" w:color="auto" w:fill="FFFFFF"/>
               </w:rPr>
-              <w:t>{{ appeal_respons</w:t>
-            </w:r>
-            <w:r>
-              <w:rPr>
-                <w:shd w:val="clear" w:color="auto" w:fill="FFFFFF"/>
-              </w:rPr>
-              <w:lastRenderedPageBreak/>
-              <w:t>e_step.subject }}</w:t>
+              <w:t>{{ appeal_response_step.subject }}</w:t>
             </w:r>
           </w:p>
         </w:tc>
@@ -5439,14 +5742,7 @@
               <w:rPr>
                 <w:shd w:val="clear" w:color="auto" w:fill="FFFFFF"/>
               </w:rPr>
-              <w:t>appeal_respo</w:t>
-            </w:r>
-            <w:r>
-              <w:rPr>
-                <w:shd w:val="clear" w:color="auto" w:fill="FFFFFF"/>
-              </w:rPr>
-              <w:lastRenderedPageBreak/>
-              <w:t>nse</w:t>
+              <w:t>appeal_response</w:t>
             </w:r>
             <w:r>
               <w:t>_content.docx")) }}</w:t>
@@ -5479,7 +5775,6 @@
               <w:rPr>
                 <w:shd w:val="clear" w:color="auto" w:fill="FFFFFF"/>
               </w:rPr>
-              <w:lastRenderedPageBreak/>
               <w:t>{%tr endif %}</w:t>
             </w:r>
           </w:p>
@@ -5591,10 +5886,7 @@
               <w:t xml:space="preserve">{{ </w:t>
             </w:r>
             <w:r>
-              <w:t>appeal_contact_parent_step</w:t>
-            </w:r>
-            <w:r>
-              <w:t>.subject</w:t>
+              <w:t>appeal_contact_parent_step.subject</w:t>
             </w:r>
             <w:r>
               <w:rPr>
@@ -5809,7 +6101,11 @@
               <w:outlineLvl w:val="1"/>
             </w:pPr>
             <w:r>
-              <w:t>{{ get_help.subject }}</w:t>
+              <w:t xml:space="preserve">{{ get_help.subject </w:t>
+            </w:r>
+            <w:r>
+              <w:lastRenderedPageBreak/>
+              <w:t>}}</w:t>
             </w:r>
           </w:p>
         </w:tc>
@@ -5834,6 +6130,7 @@
               </w:rPr>
             </w:pPr>
             <w:r>
+              <w:lastRenderedPageBreak/>
               <w:t xml:space="preserve">{{p </w:t>
             </w:r>
             <w:r>
@@ -5843,7 +6140,11 @@
               <w:t>get_help</w:t>
             </w:r>
             <w:r>
-              <w:t>_content.docx")) }}</w:t>
+              <w:t>_cont</w:t>
+            </w:r>
+            <w:r>
+              <w:lastRenderedPageBreak/>
+              <w:t>ent.docx")) }}</w:t>
             </w:r>
           </w:p>
         </w:tc>
@@ -5854,6 +6155,7 @@
         <w:spacing w:beforeAutospacing="0" w:afterAutospacing="0"/>
       </w:pPr>
       <w:r>
+        <w:lastRenderedPageBreak/>
         <w:br w:type="textWrapping" w:clear="all"/>
       </w:r>
     </w:p>
@@ -5933,27 +6235,14 @@
     <w:r>
       <w:t xml:space="preserve"> of </w:t>
     </w:r>
-    <w:r>
-      <w:fldChar w:fldCharType="begin"/>
-    </w:r>
-    <w:r>
-      <w:instrText xml:space="preserve"> NUMPAGES \* ARABIC </w:instrText>
-    </w:r>
-    <w:r>
-      <w:fldChar w:fldCharType="separate"/>
-    </w:r>
-    <w:r>
-      <w:rPr>
-        <w:noProof/>
-      </w:rPr>
-      <w:t>50</w:t>
-    </w:r>
-    <w:r>
-      <w:rPr>
-        <w:noProof/>
-      </w:rPr>
-      <w:fldChar w:fldCharType="end"/>
-    </w:r>
+    <w:fldSimple w:instr=" NUMPAGES \* ARABIC ">
+      <w:r>
+        <w:rPr>
+          <w:noProof/>
+        </w:rPr>
+        <w:t>50</w:t>
+      </w:r>
+    </w:fldSimple>
     <w:r>
       <w:t xml:space="preserve"> pages</w:t>
     </w:r>
@@ -6008,21 +6297,11 @@
     <w:r>
       <w:t xml:space="preserve"> of </w:t>
     </w:r>
-    <w:r>
-      <w:fldChar w:fldCharType="begin"/>
-    </w:r>
-    <w:r>
-      <w:instrText xml:space="preserve"> NUMPAGES \* ARABIC </w:instrText>
-    </w:r>
-    <w:r>
-      <w:fldChar w:fldCharType="separate"/>
-    </w:r>
-    <w:r>
-      <w:t>47</w:t>
-    </w:r>
-    <w:r>
-      <w:fldChar w:fldCharType="end"/>
-    </w:r>
+    <w:fldSimple w:instr=" NUMPAGES \* ARABIC ">
+      <w:r>
+        <w:t>47</w:t>
+      </w:r>
+    </w:fldSimple>
     <w:r>
       <w:t xml:space="preserve"> pages</w:t>
     </w:r>

</xml_diff>

<commit_message>
Added condition to filing step in docx so the filing steps show up in responding
</commit_message>
<xml_diff>
--- a/docassemble/ChangingChildCustody/data/templates/changing_child_custody_action_plan.docx
+++ b/docassemble/ChangingChildCustody/data/templates/changing_child_custody_action_plan.docx
@@ -2734,13 +2734,7 @@
               <w:rPr>
                 <w:color w:val="E056D6"/>
               </w:rPr>
-              <w:t xml:space="preserve"> </w:t>
-            </w:r>
-            <w:r>
-              <w:rPr>
-                <w:color w:val="E056D6"/>
-              </w:rPr>
-              <w:t xml:space="preserve">and </w:t>
+              <w:t xml:space="preserve"> and </w:t>
             </w:r>
             <w:r>
               <w:rPr>
@@ -2783,189 +2777,12 @@
             <w:pPr>
               <w:pStyle w:val="Body"/>
               <w:rPr>
-                <w:color w:val="E056D6"/>
+                <w:color w:val="auto"/>
               </w:rPr>
             </w:pPr>
             <w:r>
               <w:lastRenderedPageBreak/>
               <w:t>learn_set_aside_step and fill_set_aside_step in aka2j_mod_cust_div_templates.yml</w:t>
-            </w:r>
-            <w:r>
-              <w:br/>
-              <w:t xml:space="preserve"> </w:t>
-            </w:r>
-            <w:r>
-              <w:rPr>
-                <w:color w:val="E056D6"/>
-              </w:rPr>
-              <w:t>if middle_of_case == 'no' \</w:t>
-            </w:r>
-          </w:p>
-          <w:p>
-            <w:pPr>
-              <w:pStyle w:val="Body"/>
-              <w:rPr>
-                <w:color w:val="E056D6"/>
-              </w:rPr>
-            </w:pPr>
-            <w:r>
-              <w:rPr>
-                <w:color w:val="E056D6"/>
-              </w:rPr>
-              <w:t xml:space="preserve">      and why_change == 'problem' \</w:t>
-            </w:r>
-          </w:p>
-          <w:p>
-            <w:pPr>
-              <w:pStyle w:val="Body"/>
-              <w:rPr>
-                <w:color w:val="E056D6"/>
-              </w:rPr>
-            </w:pPr>
-            <w:r>
-              <w:rPr>
-                <w:color w:val="E056D6"/>
-              </w:rPr>
-              <w:t xml:space="preserve">      and final_order_date_within_15_days:</w:t>
-            </w:r>
-            <w:r>
-              <w:rPr>
-                <w:color w:val="E056D6"/>
-              </w:rPr>
-              <w:br/>
-            </w:r>
-            <w:r>
-              <w:rPr>
-                <w:color w:val="E056D6"/>
-              </w:rPr>
-              <w:br/>
-            </w:r>
-            <w:r>
-              <w:t xml:space="preserve"> </w:t>
-            </w:r>
-            <w:r>
-              <w:rPr>
-                <w:color w:val="E056D6"/>
-              </w:rPr>
-              <w:t>if (defined('final_order_period') \</w:t>
-            </w:r>
-          </w:p>
-          <w:p>
-            <w:pPr>
-              <w:pStyle w:val="Body"/>
-              <w:rPr>
-                <w:color w:val="E056D6"/>
-              </w:rPr>
-            </w:pPr>
-            <w:r>
-              <w:rPr>
-                <w:color w:val="E056D6"/>
-              </w:rPr>
-              <w:t xml:space="preserve">            and guess_final_order_date != 'unknown') \</w:t>
-            </w:r>
-          </w:p>
-          <w:p>
-            <w:pPr>
-              <w:pStyle w:val="Body"/>
-              <w:rPr>
-                <w:color w:val="E056D6"/>
-              </w:rPr>
-            </w:pPr>
-            <w:r>
-              <w:rPr>
-                <w:color w:val="E056D6"/>
-              </w:rPr>
-              <w:t xml:space="preserve">          or (final_order_date != '' \</w:t>
-            </w:r>
-          </w:p>
-          <w:p>
-            <w:pPr>
-              <w:pStyle w:val="Body"/>
-              <w:rPr>
-                <w:color w:val="E056D6"/>
-              </w:rPr>
-            </w:pPr>
-            <w:r>
-              <w:rPr>
-                <w:color w:val="E056D6"/>
-              </w:rPr>
-              <w:t xml:space="preserve">            and date_difference(starting=final_order_date, ending=today()).days &gt; 15)</w:t>
-            </w:r>
-            <w:r>
-              <w:rPr>
-                <w:color w:val="E056D6"/>
-              </w:rPr>
-              <w:br/>
-            </w:r>
-            <w:r>
-              <w:rPr>
-                <w:color w:val="E056D6"/>
-              </w:rPr>
-              <w:br/>
-            </w:r>
-            <w:r>
-              <w:rPr>
-                <w:color w:val="E056D6"/>
-              </w:rPr>
-              <w:br/>
-            </w:r>
-            <w:r>
-              <w:rPr>
-                <w:color w:val="E056D6"/>
-              </w:rPr>
-              <w:br/>
-            </w:r>
-            <w:r>
-              <w:rPr>
-                <w:color w:val="E056D6"/>
-              </w:rPr>
-              <w:lastRenderedPageBreak/>
-              <w:t xml:space="preserve">or </w:t>
-            </w:r>
-            <w:r>
-              <w:rPr>
-                <w:color w:val="E056D6"/>
-              </w:rPr>
-              <w:br/>
-            </w:r>
-            <w:r>
-              <w:t xml:space="preserve"> </w:t>
-            </w:r>
-            <w:r>
-              <w:rPr>
-                <w:color w:val="E056D6"/>
-              </w:rPr>
-              <w:t>if defined('final_order_period') \</w:t>
-            </w:r>
-          </w:p>
-          <w:p>
-            <w:pPr>
-              <w:pStyle w:val="Body"/>
-              <w:rPr>
-                <w:color w:val="E056D6"/>
-              </w:rPr>
-            </w:pPr>
-            <w:r>
-              <w:rPr>
-                <w:color w:val="E056D6"/>
-              </w:rPr>
-              <w:t xml:space="preserve">          and guess_final_order_date == 'unknown':</w:t>
-            </w:r>
-            <w:r>
-              <w:rPr>
-                <w:color w:val="E056D6"/>
-              </w:rPr>
-              <w:br/>
-              <w:t xml:space="preserve">and </w:t>
-            </w:r>
-            <w:r>
-              <w:t xml:space="preserve"> </w:t>
-            </w:r>
-            <w:r>
-              <w:rPr>
-                <w:color w:val="E056D6"/>
-              </w:rPr>
-              <w:t>unknown_final_date['set aside']</w:t>
             </w:r>
           </w:p>
         </w:tc>
@@ -4065,7 +3882,68 @@
               <w:rPr>
                 <w:shd w:val="clear" w:color="auto" w:fill="FFFFFF"/>
               </w:rPr>
-              <w:t>{%tr if user_need == 'change foreign custody order' or (user_need in('change custody order', 'change divorce order') and not unknown_final_date.all_true('appeal', exclusive = True))</w:t>
+              <w:t xml:space="preserve">{%tr if </w:t>
+            </w:r>
+            <w:r>
+              <w:rPr>
+                <w:color w:val="FF0000"/>
+                <w:shd w:val="clear" w:color="auto" w:fill="FFFFFF"/>
+              </w:rPr>
+              <w:t>(</w:t>
+            </w:r>
+            <w:r>
+              <w:rPr>
+                <w:shd w:val="clear" w:color="auto" w:fill="FFFFFF"/>
+              </w:rPr>
+              <w:t>user_need == 'change foreign custody order' or (user_need in('change custody order', 'change divorce order') and not unknown_final_date.all_true('appeal', exclusive = True))</w:t>
+            </w:r>
+            <w:r>
+              <w:rPr>
+                <w:color w:val="FF0000"/>
+                <w:shd w:val="clear" w:color="auto" w:fill="FFFFFF"/>
+              </w:rPr>
+              <w:t>)</w:t>
+            </w:r>
+            <w:r>
+              <w:rPr>
+                <w:color w:val="FF0000"/>
+                <w:shd w:val="clear" w:color="auto" w:fill="FFFFFF"/>
+              </w:rPr>
+              <w:t xml:space="preserve"> </w:t>
+            </w:r>
+            <w:r>
+              <w:rPr>
+                <w:color w:val="FF0000"/>
+                <w:shd w:val="clear" w:color="auto" w:fill="FFFFFF"/>
+              </w:rPr>
+              <w:t>or (</w:t>
+            </w:r>
+            <w:r>
+              <w:rPr>
+                <w:color w:val="000000"/>
+                <w:shd w:val="clear" w:color="auto" w:fill="FFFFFF"/>
+              </w:rPr>
+              <w:t>user_need in</w:t>
+            </w:r>
+            <w:r>
+              <w:rPr>
+                <w:color w:val="auto"/>
+              </w:rPr>
+              <w:t>('respond to motion in custody', 'respond to motion in divorce')</w:t>
+            </w:r>
+            <w:r>
+              <w:rPr>
+                <w:color w:val="000000"/>
+                <w:shd w:val="clear" w:color="auto" w:fill="FFFFFF"/>
+              </w:rPr>
+              <w:t xml:space="preserve"> and type_of_response in('reconsider', 'modify', 'set aside')</w:t>
+            </w:r>
+            <w:r>
+              <w:rPr>
+                <w:color w:val="FF0000"/>
+                <w:shd w:val="clear" w:color="auto" w:fill="FFFFFF"/>
+              </w:rPr>
+              <w:t>)</w:t>
             </w:r>
             <w:r>
               <w:rPr>
@@ -4206,6 +4084,7 @@
               <w:rPr>
                 <w:shd w:val="clear" w:color="auto" w:fill="FFFFFF"/>
               </w:rPr>
+              <w:lastRenderedPageBreak/>
               <w:t>{%tr endif %}</w:t>
             </w:r>
           </w:p>
@@ -4247,36 +4126,58 @@
           <w:p>
             <w:pPr>
               <w:pStyle w:val="Body"/>
-              <w:rPr>
-                <w:strike/>
-                <w:shd w:val="clear" w:color="auto" w:fill="FFFFFF"/>
-              </w:rPr>
-            </w:pPr>
-            <w:r>
-              <w:rPr>
-                <w:strike/>
-                <w:color w:val="FF00FF"/>
-                <w:shd w:val="clear" w:color="auto" w:fill="FFFFFF"/>
-              </w:rPr>
-              <w:t xml:space="preserve">if </w:t>
-            </w:r>
-            <w:r>
-              <w:rPr>
-                <w:strike/>
-                <w:color w:val="FF00FF"/>
-                <w:shd w:val="clear" w:color="auto" w:fill="FFFFFF"/>
-              </w:rPr>
-              <w:br/>
-              <w:t xml:space="preserve">type_of_response in('reconsider', 'modify', </w:t>
-            </w:r>
-            <w:r>
-              <w:rPr>
-                <w:strike/>
-                <w:color w:val="FF00FF"/>
-                <w:shd w:val="clear" w:color="auto" w:fill="FFFFFF"/>
-              </w:rPr>
-              <w:lastRenderedPageBreak/>
-              <w:t>'set aside')</w:t>
+            </w:pPr>
+            <w:r>
+              <w:rPr>
+                <w:shd w:val="clear" w:color="auto" w:fill="FFFFFF"/>
+              </w:rPr>
+              <w:t xml:space="preserve">{%tr if user_need == 'change foreign custody order' or </w:t>
+            </w:r>
+            <w:r>
+              <w:rPr>
+                <w:color w:val="FF0000"/>
+                <w:shd w:val="clear" w:color="auto" w:fill="FFFFFF"/>
+              </w:rPr>
+              <w:t>(</w:t>
+            </w:r>
+            <w:r>
+              <w:rPr>
+                <w:shd w:val="clear" w:color="auto" w:fill="FFFFFF"/>
+              </w:rPr>
+              <w:t>user_need in('change custody order', 'change divorce order') and not unknown_final_date.all_true</w:t>
+            </w:r>
+            <w:r>
+              <w:rPr>
+                <w:color w:val="00B0F0"/>
+                <w:shd w:val="clear" w:color="auto" w:fill="FFFFFF"/>
+              </w:rPr>
+              <w:t>(</w:t>
+            </w:r>
+            <w:r>
+              <w:rPr>
+                <w:shd w:val="clear" w:color="auto" w:fill="FFFFFF"/>
+              </w:rPr>
+              <w:t>'appeal', exclusive = True</w:t>
+            </w:r>
+            <w:r>
+              <w:rPr>
+                <w:color w:val="00B0F0"/>
+                <w:shd w:val="clear" w:color="auto" w:fill="FFFFFF"/>
+              </w:rPr>
+              <w:t>)</w:t>
+            </w:r>
+            <w:r>
+              <w:rPr>
+                <w:color w:val="FF0000"/>
+                <w:shd w:val="clear" w:color="auto" w:fill="FFFFFF"/>
+              </w:rPr>
+              <w:t xml:space="preserve">) or </w:t>
+            </w:r>
+            <w:r>
+              <w:rPr>
+                <w:shd w:val="clear" w:color="auto" w:fill="FFFFFF"/>
+              </w:rPr>
+              <w:t>type_of_response in('reconsider', 'modify', 'set aside') %}</w:t>
             </w:r>
           </w:p>
         </w:tc>
@@ -4295,33 +4196,10 @@
           </w:tcPr>
           <w:p>
             <w:pPr>
-              <w:widowControl w:val="0"/>
-              <w:rPr>
-                <w:rFonts w:eastAsia="Calibri"/>
-                <w:color w:val="FF00FF"/>
-              </w:rPr>
-            </w:pPr>
-            <w:r>
-              <w:rPr>
-                <w:rFonts w:eastAsia="Calibri"/>
-                <w:strike/>
-              </w:rPr>
-              <w:lastRenderedPageBreak/>
-              <w:t>file_response_step in aka2j_motion_response_templates.yml</w:t>
-            </w:r>
-            <w:r>
-              <w:rPr>
-                <w:rFonts w:eastAsia="Calibri"/>
-                <w:strike/>
-              </w:rPr>
-              <w:br/>
-            </w:r>
-            <w:r>
-              <w:rPr>
-                <w:rFonts w:eastAsia="Calibri"/>
-                <w:color w:val="FF00FF"/>
-              </w:rPr>
-              <w:t>truefiling_serve_step?</w:t>
+              <w:pStyle w:val="Body"/>
+            </w:pPr>
+            <w:r>
+              <w:t>serve_motion_response_step in aka2j_motion_response_templates.yml</w:t>
             </w:r>
           </w:p>
         </w:tc>
@@ -4346,7 +4224,13 @@
               <w:outlineLvl w:val="1"/>
             </w:pPr>
             <w:r>
-              <w:t>File response</w:t>
+              <w:t xml:space="preserve">{{ </w:t>
+            </w:r>
+            <w:r>
+              <w:t>truefiling_serve_</w:t>
+            </w:r>
+            <w:r>
+              <w:t>step.subject }}</w:t>
             </w:r>
           </w:p>
         </w:tc>
@@ -4368,7 +4252,31 @@
               <w:pStyle w:val="Body"/>
             </w:pPr>
             <w:r>
-              <w:t xml:space="preserve">File response </w:t>
+              <w:t xml:space="preserve">{{p </w:t>
+            </w:r>
+            <w:r>
+              <w:t>(include_docx_template("docassemble.AKA2JBranding:</w:t>
+            </w:r>
+            <w:r>
+              <w:rPr>
+                <w:shd w:val="clear" w:color="auto" w:fill="FFFFFF"/>
+              </w:rPr>
+              <w:t>truefiling_</w:t>
+            </w:r>
+            <w:r>
+              <w:rPr>
+                <w:shd w:val="clear" w:color="auto" w:fill="FFFFFF"/>
+              </w:rPr>
+              <w:t>s</w:t>
+            </w:r>
+            <w:r>
+              <w:rPr>
+                <w:shd w:val="clear" w:color="auto" w:fill="FFFFFF"/>
+              </w:rPr>
+              <w:t>erve_content.docx</w:t>
+            </w:r>
+            <w:r>
+              <w:t>")) }}</w:t>
             </w:r>
           </w:p>
         </w:tc>
@@ -4391,6 +4299,9 @@
             <w:pPr>
               <w:pStyle w:val="Body"/>
             </w:pPr>
+            <w:r>
+              <w:t>{%tr endif %}</w:t>
+            </w:r>
           </w:p>
         </w:tc>
         <w:tc>
@@ -4408,7 +4319,10 @@
           </w:tcPr>
           <w:p>
             <w:pPr>
-              <w:pStyle w:val="Body"/>
+              <w:widowControl w:val="0"/>
+              <w:rPr>
+                <w:rFonts w:eastAsia="Calibri"/>
+              </w:rPr>
             </w:pPr>
           </w:p>
         </w:tc>
@@ -4430,58 +4344,145 @@
           <w:p>
             <w:pPr>
               <w:pStyle w:val="Body"/>
-            </w:pPr>
-            <w:r>
-              <w:rPr>
-                <w:shd w:val="clear" w:color="auto" w:fill="FFFFFF"/>
-              </w:rPr>
-              <w:t xml:space="preserve">{%tr if user_need == 'change foreign custody order' or </w:t>
+              <w:rPr>
+                <w:shd w:val="clear" w:color="auto" w:fill="FFFFFF"/>
+              </w:rPr>
+            </w:pPr>
+            <w:r>
+              <w:t xml:space="preserve">{%tr if user_need in('change custody order', 'change foreign custody order') and not </w:t>
+            </w:r>
+            <w:r>
+              <w:rPr>
+                <w:color w:val="92D050"/>
+              </w:rPr>
+              <w:t>(</w:t>
+            </w:r>
+            <w:r>
+              <w:t>interim_order_date_within_10_days or final_order_date_within_10_days</w:t>
+            </w:r>
+            <w:r>
+              <w:rPr>
+                <w:color w:val="92D050"/>
+              </w:rPr>
+              <w:t>) and (</w:t>
+            </w:r>
+            <w:r>
+              <w:t xml:space="preserve">not defined('unknown_final_date') </w:t>
+            </w:r>
+            <w:r>
+              <w:rPr>
+                <w:color w:val="FFC000"/>
+              </w:rPr>
+              <w:t>or</w:t>
+            </w:r>
+            <w:r>
+              <w:t xml:space="preserve"> </w:t>
+            </w:r>
+            <w:r>
+              <w:rPr>
+                <w:color w:val="FFC000"/>
+              </w:rPr>
+              <w:t>(</w:t>
             </w:r>
             <w:r>
               <w:rPr>
                 <w:color w:val="FF0000"/>
-                <w:shd w:val="clear" w:color="auto" w:fill="FFFFFF"/>
               </w:rPr>
               <w:t>(</w:t>
             </w:r>
             <w:r>
-              <w:rPr>
-                <w:shd w:val="clear" w:color="auto" w:fill="FFFFFF"/>
-              </w:rPr>
-              <w:t>user_need in('change custody order', 'change divorce order') and not unknown_final_date.all_true</w:t>
-            </w:r>
-            <w:r>
-              <w:rPr>
-                <w:color w:val="00B0F0"/>
-                <w:shd w:val="clear" w:color="auto" w:fill="FFFFFF"/>
+              <w:t>unknown_final_date.true_values()</w:t>
+            </w:r>
+            <w:r>
+              <w:rPr>
+                <w:color w:val="FF0000"/>
+              </w:rPr>
+              <w:t>)</w:t>
+            </w:r>
+            <w:r>
+              <w:t xml:space="preserve">|list|length == 1 </w:t>
+            </w:r>
+            <w:r>
+              <w:rPr>
+                <w:color w:val="FFC000"/>
+              </w:rPr>
+              <w:t xml:space="preserve">and not </w:t>
+            </w:r>
+            <w:r>
+              <w:rPr>
+                <w:color w:val="FF0000"/>
               </w:rPr>
               <w:t>(</w:t>
             </w:r>
             <w:r>
-              <w:rPr>
-                <w:shd w:val="clear" w:color="auto" w:fill="FFFFFF"/>
-              </w:rPr>
-              <w:t>'appeal', exclusive = True</w:t>
-            </w:r>
-            <w:r>
-              <w:rPr>
-                <w:color w:val="00B0F0"/>
-                <w:shd w:val="clear" w:color="auto" w:fill="FFFFFF"/>
+              <w:t>unknown_final_date['rec</w:t>
+            </w:r>
+            <w:r>
+              <w:lastRenderedPageBreak/>
+              <w:t xml:space="preserve">onsider'] </w:t>
+            </w:r>
+            <w:r>
+              <w:rPr>
+                <w:color w:val="FF0000"/>
+              </w:rPr>
+              <w:t xml:space="preserve">or </w:t>
+            </w:r>
+            <w:r>
+              <w:t>unknown_final_date['appeal'])</w:t>
+            </w:r>
+            <w:r>
+              <w:rPr>
+                <w:color w:val="FF0000"/>
               </w:rPr>
               <w:t>)</w:t>
             </w:r>
             <w:r>
               <w:rPr>
+                <w:color w:val="FFC000"/>
+              </w:rPr>
+              <w:t xml:space="preserve"> or (</w:t>
+            </w:r>
+            <w:r>
+              <w:rPr>
                 <w:color w:val="FF0000"/>
-                <w:shd w:val="clear" w:color="auto" w:fill="FFFFFF"/>
-              </w:rPr>
-              <w:t xml:space="preserve">) or </w:t>
-            </w:r>
-            <w:r>
-              <w:rPr>
-                <w:shd w:val="clear" w:color="auto" w:fill="FFFFFF"/>
-              </w:rPr>
-              <w:t>type_of_response in('reconsider', 'modify', 'set aside') %}</w:t>
+              </w:rPr>
+              <w:t>(</w:t>
+            </w:r>
+            <w:r>
+              <w:t>unknown_final_date.true_values()</w:t>
+            </w:r>
+            <w:r>
+              <w:rPr>
+                <w:color w:val="FF0000"/>
+              </w:rPr>
+              <w:t>)</w:t>
+            </w:r>
+            <w:r>
+              <w:t xml:space="preserve">|list|length &gt;= 2 </w:t>
+            </w:r>
+            <w:r>
+              <w:rPr>
+                <w:color w:val="FFC000"/>
+              </w:rPr>
+              <w:t>and</w:t>
+            </w:r>
+            <w:r>
+              <w:t xml:space="preserve"> unknown_final_date['set aside']</w:t>
+            </w:r>
+            <w:r>
+              <w:rPr>
+                <w:color w:val="FFC000"/>
+              </w:rPr>
+              <w:t>)</w:t>
+            </w:r>
+            <w:r>
+              <w:rPr>
+                <w:color w:val="92D050"/>
+              </w:rPr>
+              <w:t>)</w:t>
+            </w:r>
+            <w:r>
+              <w:t>%}</w:t>
             </w:r>
           </w:p>
         </w:tc>
@@ -4503,7 +4504,8 @@
               <w:pStyle w:val="Body"/>
             </w:pPr>
             <w:r>
-              <w:t>serve_motion_response_step in aka2j_motion_response_templates.yml</w:t>
+              <w:lastRenderedPageBreak/>
+              <w:t>expect_after_motion_step in aka2j_mod_cust_div_templates.yml</w:t>
             </w:r>
           </w:p>
         </w:tc>
@@ -4526,15 +4528,21 @@
             <w:pPr>
               <w:pStyle w:val="Heading2"/>
               <w:outlineLvl w:val="1"/>
-            </w:pPr>
-            <w:r>
+              <w:rPr>
+                <w:shd w:val="clear" w:color="auto" w:fill="FFFFFF"/>
+              </w:rPr>
+            </w:pPr>
+            <w:r>
+              <w:rPr>
+                <w:shd w:val="clear" w:color="auto" w:fill="FFFFFF"/>
+              </w:rPr>
               <w:t xml:space="preserve">{{ </w:t>
             </w:r>
             <w:r>
-              <w:t>truefiling_serve_</w:t>
-            </w:r>
-            <w:r>
-              <w:t>step.subject }}</w:t>
+              <w:t>expect_after_motion_or_answer</w:t>
+            </w:r>
+            <w:r>
+              <w:t>_step.subject }}</w:t>
             </w:r>
           </w:p>
         </w:tc>
@@ -4554,6 +4562,12 @@
           <w:p>
             <w:pPr>
               <w:pStyle w:val="Body"/>
+              <w:spacing w:before="0" w:after="60"/>
+            </w:pPr>
+          </w:p>
+          <w:p>
+            <w:pPr>
+              <w:pStyle w:val="Body"/>
             </w:pPr>
             <w:r>
               <w:t xml:space="preserve">{{p </w:t>
@@ -4565,22 +4579,10 @@
               <w:rPr>
                 <w:shd w:val="clear" w:color="auto" w:fill="FFFFFF"/>
               </w:rPr>
-              <w:t>truefiling_</w:t>
-            </w:r>
-            <w:r>
-              <w:rPr>
-                <w:shd w:val="clear" w:color="auto" w:fill="FFFFFF"/>
-              </w:rPr>
-              <w:t>s</w:t>
-            </w:r>
-            <w:r>
-              <w:rPr>
-                <w:shd w:val="clear" w:color="auto" w:fill="FFFFFF"/>
-              </w:rPr>
-              <w:t>erve_content.docx</w:t>
-            </w:r>
-            <w:r>
-              <w:t>")) }}</w:t>
+              <w:t>expect_after_motion_or_answer</w:t>
+            </w:r>
+            <w:r>
+              <w:t>_content.docx")) }}</w:t>
             </w:r>
           </w:p>
         </w:tc>
@@ -4602,8 +4604,14 @@
           <w:p>
             <w:pPr>
               <w:pStyle w:val="Body"/>
-            </w:pPr>
-            <w:r>
+              <w:rPr>
+                <w:shd w:val="clear" w:color="auto" w:fill="FFFFFF"/>
+              </w:rPr>
+            </w:pPr>
+            <w:r>
+              <w:rPr>
+                <w:shd w:val="clear" w:color="auto" w:fill="FFFFFF"/>
+              </w:rPr>
               <w:t>{%tr endif %}</w:t>
             </w:r>
           </w:p>
@@ -4653,140 +4661,7 @@
               </w:rPr>
             </w:pPr>
             <w:r>
-              <w:t xml:space="preserve">{%tr if user_need in('change custody order', 'change foreign custody order') and not </w:t>
-            </w:r>
-            <w:r>
-              <w:rPr>
-                <w:color w:val="92D050"/>
-              </w:rPr>
-              <w:t>(</w:t>
-            </w:r>
-            <w:r>
-              <w:t>interim_order_date_within_10_days or final_order_date_within_10_days</w:t>
-            </w:r>
-            <w:r>
-              <w:rPr>
-                <w:color w:val="92D050"/>
-              </w:rPr>
-              <w:t>) and (</w:t>
-            </w:r>
-            <w:r>
-              <w:t>not defined('unknown_final_</w:t>
-            </w:r>
-            <w:r>
-              <w:lastRenderedPageBreak/>
-              <w:t xml:space="preserve">date') </w:t>
-            </w:r>
-            <w:r>
-              <w:rPr>
-                <w:color w:val="FFC000"/>
-              </w:rPr>
-              <w:t>or</w:t>
-            </w:r>
-            <w:r>
-              <w:t xml:space="preserve"> </w:t>
-            </w:r>
-            <w:r>
-              <w:rPr>
-                <w:color w:val="FFC000"/>
-              </w:rPr>
-              <w:t>(</w:t>
-            </w:r>
-            <w:r>
-              <w:rPr>
-                <w:color w:val="FF0000"/>
-              </w:rPr>
-              <w:t>(</w:t>
-            </w:r>
-            <w:r>
-              <w:t>unknown_final_date.true_values()</w:t>
-            </w:r>
-            <w:r>
-              <w:rPr>
-                <w:color w:val="FF0000"/>
-              </w:rPr>
-              <w:t>)</w:t>
-            </w:r>
-            <w:r>
-              <w:t xml:space="preserve">|list|length == 1 </w:t>
-            </w:r>
-            <w:r>
-              <w:rPr>
-                <w:color w:val="FFC000"/>
-              </w:rPr>
-              <w:t xml:space="preserve">and not </w:t>
-            </w:r>
-            <w:r>
-              <w:rPr>
-                <w:color w:val="FF0000"/>
-              </w:rPr>
-              <w:t>(</w:t>
-            </w:r>
-            <w:r>
-              <w:t xml:space="preserve">unknown_final_date['reconsider'] </w:t>
-            </w:r>
-            <w:r>
-              <w:rPr>
-                <w:color w:val="FF0000"/>
-              </w:rPr>
-              <w:t xml:space="preserve">or </w:t>
-            </w:r>
-            <w:r>
-              <w:t>unknown_final_date['appeal'])</w:t>
-            </w:r>
-            <w:r>
-              <w:rPr>
-                <w:color w:val="FF0000"/>
-              </w:rPr>
-              <w:t>)</w:t>
-            </w:r>
-            <w:r>
-              <w:rPr>
-                <w:color w:val="FFC000"/>
-              </w:rPr>
-              <w:t xml:space="preserve"> or (</w:t>
-            </w:r>
-            <w:r>
-              <w:rPr>
-                <w:color w:val="FF0000"/>
-              </w:rPr>
-              <w:t>(</w:t>
-            </w:r>
-            <w:r>
-              <w:t>unknown_final_date.true_values()</w:t>
-            </w:r>
-            <w:r>
-              <w:rPr>
-                <w:color w:val="FF0000"/>
-              </w:rPr>
-              <w:t>)</w:t>
-            </w:r>
-            <w:r>
-              <w:t xml:space="preserve">|list|length &gt;= 2 </w:t>
-            </w:r>
-            <w:r>
-              <w:rPr>
-                <w:color w:val="FFC000"/>
-              </w:rPr>
-              <w:t>and</w:t>
-            </w:r>
-            <w:r>
-              <w:t xml:space="preserve"> unknown_final_date['set aside']</w:t>
-            </w:r>
-            <w:r>
-              <w:rPr>
-                <w:color w:val="FFC000"/>
-              </w:rPr>
-              <w:t>)</w:t>
-            </w:r>
-            <w:r>
-              <w:rPr>
-                <w:color w:val="92D050"/>
-              </w:rPr>
-              <w:t>)</w:t>
-            </w:r>
-            <w:r>
-              <w:t>%}</w:t>
+              <w:t>{%tr if interim_order_date_within_10_days or final_order_date_within_10_days or unknown_final_date['reconsider'] %}</w:t>
             </w:r>
           </w:p>
         </w:tc>
@@ -4805,11 +4680,16 @@
           </w:tcPr>
           <w:p>
             <w:pPr>
-              <w:pStyle w:val="Body"/>
-            </w:pPr>
-            <w:r>
-              <w:lastRenderedPageBreak/>
-              <w:t>expect_after_motion_step in aka2j_mod_cust_div_templates.yml</w:t>
+              <w:widowControl w:val="0"/>
+              <w:rPr>
+                <w:rFonts w:eastAsia="Calibri"/>
+              </w:rPr>
+            </w:pPr>
+            <w:r>
+              <w:rPr>
+                <w:rFonts w:eastAsia="Calibri"/>
+              </w:rPr>
+              <w:t>expect_reconsider_step in aka2j_mod_cust_div_templates.yml</w:t>
             </w:r>
           </w:p>
         </w:tc>
@@ -4832,21 +4712,15 @@
             <w:pPr>
               <w:pStyle w:val="Heading2"/>
               <w:outlineLvl w:val="1"/>
-              <w:rPr>
-                <w:shd w:val="clear" w:color="auto" w:fill="FFFFFF"/>
-              </w:rPr>
-            </w:pPr>
-            <w:r>
-              <w:rPr>
-                <w:shd w:val="clear" w:color="auto" w:fill="FFFFFF"/>
-              </w:rPr>
+            </w:pPr>
+            <w:r>
               <w:t xml:space="preserve">{{ </w:t>
             </w:r>
             <w:r>
-              <w:t>expect_after_motion_or_answer</w:t>
-            </w:r>
-            <w:r>
-              <w:t>_step.subject }}</w:t>
+              <w:t>expect_reconsider_step</w:t>
+            </w:r>
+            <w:r>
+              <w:t>.subject }}</w:t>
             </w:r>
           </w:p>
         </w:tc>
@@ -4868,6 +4742,9 @@
               <w:pStyle w:val="Body"/>
               <w:spacing w:before="0" w:after="60"/>
             </w:pPr>
+            <w:r>
+              <w:t xml:space="preserve"> </w:t>
+            </w:r>
           </w:p>
           <w:p>
             <w:pPr>
@@ -4883,7 +4760,13 @@
               <w:rPr>
                 <w:shd w:val="clear" w:color="auto" w:fill="FFFFFF"/>
               </w:rPr>
-              <w:t>expect_after_motion_or_answer</w:t>
+              <w:t>expect_</w:t>
+            </w:r>
+            <w:r>
+              <w:rPr>
+                <w:shd w:val="clear" w:color="auto" w:fill="FFFFFF"/>
+              </w:rPr>
+              <w:t>reconsider</w:t>
             </w:r>
             <w:r>
               <w:t>_content.docx")) }}</w:t>
@@ -4965,7 +4848,23 @@
               </w:rPr>
             </w:pPr>
             <w:r>
-              <w:t>{%tr if interim_order_date_within_10_days or final_order_date_within_10_days or unknown_final_date['reconsider'] %}</w:t>
+              <w:rPr>
+                <w:shd w:val="clear" w:color="auto" w:fill="FFFFFF"/>
+              </w:rPr>
+              <w:t xml:space="preserve">{%tr if </w:t>
+            </w:r>
+            <w:r>
+              <w:rPr>
+                <w:shd w:val="clear" w:color="auto" w:fill="FFFFFF"/>
+              </w:rPr>
+              <w:br/>
+            </w:r>
+            <w:r>
+              <w:rPr>
+                <w:shd w:val="clear" w:color="auto" w:fill="FFFFFF"/>
+              </w:rPr>
+              <w:lastRenderedPageBreak/>
+              <w:t>type_of_response in('modify', 'set aside') %}</w:t>
             </w:r>
           </w:p>
         </w:tc>
@@ -4992,8 +4891,10 @@
             <w:r>
               <w:rPr>
                 <w:rFonts w:eastAsia="Calibri"/>
-              </w:rPr>
-              <w:t>expect_reconsider_step in aka2j_mod_cust_div_templates.yml</w:t>
+                <w:shd w:val="clear" w:color="auto" w:fill="FFFFFF"/>
+              </w:rPr>
+              <w:lastRenderedPageBreak/>
+              <w:t>expect_after_response_step in aka2j_motion_response_templates.yml</w:t>
             </w:r>
           </w:p>
         </w:tc>
@@ -5016,14 +4917,26 @@
             <w:pPr>
               <w:pStyle w:val="Heading2"/>
               <w:outlineLvl w:val="1"/>
-            </w:pPr>
-            <w:r>
+              <w:rPr>
+                <w:shd w:val="clear" w:color="auto" w:fill="FFFFFF"/>
+              </w:rPr>
+            </w:pPr>
+            <w:r>
+              <w:rPr>
+                <w:shd w:val="clear" w:color="auto" w:fill="FFFFFF"/>
+              </w:rPr>
               <w:t xml:space="preserve">{{ </w:t>
             </w:r>
             <w:r>
-              <w:t>expect_reconsider_step</w:t>
-            </w:r>
-            <w:r>
+              <w:rPr>
+                <w:shd w:val="clear" w:color="auto" w:fill="FFFFFF"/>
+              </w:rPr>
+              <w:t>expect_after_response_step</w:t>
+            </w:r>
+            <w:r>
+              <w:rPr>
+                <w:shd w:val="clear" w:color="auto" w:fill="FFFFFF"/>
+              </w:rPr>
               <w:t>.subject }}</w:t>
             </w:r>
           </w:p>
@@ -5046,9 +4959,6 @@
               <w:pStyle w:val="Body"/>
               <w:spacing w:before="0" w:after="60"/>
             </w:pPr>
-            <w:r>
-              <w:t xml:space="preserve"> </w:t>
-            </w:r>
           </w:p>
           <w:p>
             <w:pPr>
@@ -5064,13 +4974,13 @@
               <w:rPr>
                 <w:shd w:val="clear" w:color="auto" w:fill="FFFFFF"/>
               </w:rPr>
-              <w:t>expect_</w:t>
-            </w:r>
-            <w:r>
-              <w:rPr>
-                <w:shd w:val="clear" w:color="auto" w:fill="FFFFFF"/>
-              </w:rPr>
-              <w:t>reconsider</w:t>
+              <w:t>expect_after_</w:t>
+            </w:r>
+            <w:r>
+              <w:rPr>
+                <w:shd w:val="clear" w:color="auto" w:fill="FFFFFF"/>
+              </w:rPr>
+              <w:t>response</w:t>
             </w:r>
             <w:r>
               <w:t>_content.docx")) }}</w:t>
@@ -5103,7 +5013,6 @@
               <w:rPr>
                 <w:shd w:val="clear" w:color="auto" w:fill="FFFFFF"/>
               </w:rPr>
-              <w:lastRenderedPageBreak/>
               <w:t>{%tr endif %}</w:t>
             </w:r>
           </w:p>
@@ -5153,17 +5062,7 @@
               </w:rPr>
             </w:pPr>
             <w:r>
-              <w:rPr>
-                <w:shd w:val="clear" w:color="auto" w:fill="FFFFFF"/>
-              </w:rPr>
-              <w:t xml:space="preserve">{%tr if </w:t>
-            </w:r>
-            <w:r>
-              <w:rPr>
-                <w:shd w:val="clear" w:color="auto" w:fill="FFFFFF"/>
-              </w:rPr>
-              <w:br/>
-              <w:t>type_of_response in('modify', 'set aside') %}</w:t>
+              <w:t>{%tr if respond_to_modify == 'agree' or respond_to_set_aside == 'agree' %}</w:t>
             </w:r>
           </w:p>
         </w:tc>
@@ -5190,9 +5089,20 @@
             <w:r>
               <w:rPr>
                 <w:rFonts w:eastAsia="Calibri"/>
-                <w:shd w:val="clear" w:color="auto" w:fill="FFFFFF"/>
-              </w:rPr>
-              <w:t>expect_after_response_step in aka2j_motion_response_templates.yml</w:t>
+              </w:rPr>
+              <w:t>contact_other_party_step</w:t>
+            </w:r>
+            <w:r>
+              <w:rPr>
+                <w:rFonts w:eastAsia="Calibri"/>
+              </w:rPr>
+              <w:t xml:space="preserve"> </w:t>
+            </w:r>
+            <w:r>
+              <w:rPr>
+                <w:rFonts w:eastAsia="Calibri"/>
+              </w:rPr>
+              <w:t>and file_agreement_step in aka2j_motion_response_templates.yml</w:t>
             </w:r>
           </w:p>
         </w:tc>
@@ -5227,15 +5137,15 @@
             </w:r>
             <w:r>
               <w:rPr>
-                <w:shd w:val="clear" w:color="auto" w:fill="FFFFFF"/>
-              </w:rPr>
-              <w:t>expect_after_response_step</w:t>
-            </w:r>
-            <w:r>
-              <w:rPr>
-                <w:shd w:val="clear" w:color="auto" w:fill="FFFFFF"/>
-              </w:rPr>
-              <w:t>.subject }}</w:t>
+                <w:rFonts w:eastAsia="Calibri"/>
+              </w:rPr>
+              <w:t>contact_other_party_step.subject</w:t>
+            </w:r>
+            <w:r>
+              <w:rPr>
+                <w:shd w:val="clear" w:color="auto" w:fill="FFFFFF"/>
+              </w:rPr>
+              <w:t xml:space="preserve"> }}</w:t>
             </w:r>
           </w:p>
         </w:tc>
@@ -5263,22 +5173,16 @@
               <w:pStyle w:val="Body"/>
             </w:pPr>
             <w:r>
-              <w:t xml:space="preserve">{{p </w:t>
-            </w:r>
-            <w:r>
-              <w:t>(include_docx_template("docassemble.AKA2JBranding:</w:t>
-            </w:r>
-            <w:r>
-              <w:rPr>
-                <w:shd w:val="clear" w:color="auto" w:fill="FFFFFF"/>
-              </w:rPr>
-              <w:t>expect_after_</w:t>
-            </w:r>
-            <w:r>
-              <w:rPr>
-                <w:shd w:val="clear" w:color="auto" w:fill="FFFFFF"/>
-              </w:rPr>
-              <w:t>response</w:t>
+              <w:t>{{p (include</w:t>
+            </w:r>
+            <w:r>
+              <w:t>_docx_template("docassemble.AKA2JBranding:</w:t>
+            </w:r>
+            <w:r>
+              <w:rPr>
+                <w:rFonts w:eastAsia="Calibri"/>
+              </w:rPr>
+              <w:t>contact_other_party</w:t>
             </w:r>
             <w:r>
               <w:t>_content.docx")) }}</w:t>
@@ -5302,16 +5206,17 @@
           </w:tcPr>
           <w:p>
             <w:pPr>
-              <w:pStyle w:val="Body"/>
-              <w:rPr>
-                <w:shd w:val="clear" w:color="auto" w:fill="FFFFFF"/>
-              </w:rPr>
-            </w:pPr>
-            <w:r>
-              <w:rPr>
-                <w:shd w:val="clear" w:color="auto" w:fill="FFFFFF"/>
-              </w:rPr>
-              <w:t>{%tr endif %}</w:t>
+              <w:pStyle w:val="Heading2"/>
+              <w:outlineLvl w:val="1"/>
+              <w:rPr>
+                <w:shd w:val="clear" w:color="auto" w:fill="FFFFFF"/>
+              </w:rPr>
+            </w:pPr>
+            <w:r>
+              <w:rPr>
+                <w:shd w:val="clear" w:color="auto" w:fill="FFFFFF"/>
+              </w:rPr>
+              <w:t>{{ file_agreement_step.subject }}</w:t>
             </w:r>
           </w:p>
         </w:tc>
@@ -5330,11 +5235,26 @@
           </w:tcPr>
           <w:p>
             <w:pPr>
-              <w:widowControl w:val="0"/>
-              <w:rPr>
-                <w:rFonts w:eastAsia="Calibri"/>
-              </w:rPr>
-            </w:pPr>
+              <w:pStyle w:val="Body"/>
+              <w:spacing w:before="0" w:after="60"/>
+            </w:pPr>
+          </w:p>
+          <w:p>
+            <w:pPr>
+              <w:pStyle w:val="Body"/>
+            </w:pPr>
+            <w:r>
+              <w:t>{{p (include</w:t>
+            </w:r>
+            <w:r>
+              <w:t>_docx_template("docassemble.AKA2JBranding:</w:t>
+            </w:r>
+            <w:r>
+              <w:t>file_agreement</w:t>
+            </w:r>
+            <w:r>
+              <w:t>_content.docx")) }}</w:t>
+            </w:r>
           </w:p>
         </w:tc>
       </w:tr>
@@ -5360,7 +5280,10 @@
               </w:rPr>
             </w:pPr>
             <w:r>
-              <w:t>{%tr if respond_to_modify == 'agree' or respond_to_set_aside == 'agree' %}</w:t>
+              <w:rPr>
+                <w:shd w:val="clear" w:color="auto" w:fill="FFFFFF"/>
+              </w:rPr>
+              <w:t>{%tr endif %}</w:t>
             </w:r>
           </w:p>
         </w:tc>
@@ -5384,24 +5307,6 @@
                 <w:rFonts w:eastAsia="Calibri"/>
               </w:rPr>
             </w:pPr>
-            <w:r>
-              <w:rPr>
-                <w:rFonts w:eastAsia="Calibri"/>
-              </w:rPr>
-              <w:t>contact_other_party_step</w:t>
-            </w:r>
-            <w:r>
-              <w:rPr>
-                <w:rFonts w:eastAsia="Calibri"/>
-              </w:rPr>
-              <w:t xml:space="preserve"> </w:t>
-            </w:r>
-            <w:r>
-              <w:rPr>
-                <w:rFonts w:eastAsia="Calibri"/>
-              </w:rPr>
-              <w:t>and file_agreement_step in aka2j_motion_response_templates.yml</w:t>
-            </w:r>
           </w:p>
         </w:tc>
       </w:tr>
@@ -5421,29 +5326,35 @@
           </w:tcPr>
           <w:p>
             <w:pPr>
-              <w:pStyle w:val="Heading2"/>
-              <w:outlineLvl w:val="1"/>
-              <w:rPr>
-                <w:shd w:val="clear" w:color="auto" w:fill="FFFFFF"/>
-              </w:rPr>
-            </w:pPr>
-            <w:r>
-              <w:rPr>
-                <w:shd w:val="clear" w:color="auto" w:fill="FFFFFF"/>
-              </w:rPr>
-              <w:t xml:space="preserve">{{ </w:t>
-            </w:r>
-            <w:r>
-              <w:rPr>
-                <w:rFonts w:eastAsia="Calibri"/>
-              </w:rPr>
-              <w:t>contact_other_party_step.subject</w:t>
-            </w:r>
-            <w:r>
-              <w:rPr>
-                <w:shd w:val="clear" w:color="auto" w:fill="FFFFFF"/>
-              </w:rPr>
-              <w:t xml:space="preserve"> }}</w:t>
+              <w:pStyle w:val="Body"/>
+              <w:rPr>
+                <w:shd w:val="clear" w:color="auto" w:fill="FFFFFF"/>
+              </w:rPr>
+            </w:pPr>
+            <w:r>
+              <w:rPr>
+                <w:shd w:val="clear" w:color="auto" w:fill="FFFFFF"/>
+              </w:rPr>
+              <w:t>{%tr if respond_to_appeal in ('agree',</w:t>
+            </w:r>
+            <w:r>
+              <w:rPr>
+                <w:shd w:val="clear" w:color="auto" w:fill="FFFFFF"/>
+              </w:rPr>
+              <w:t xml:space="preserve"> </w:t>
+            </w:r>
+            <w:r>
+              <w:rPr>
+                <w:shd w:val="clear" w:color="auto" w:fill="FFFFFF"/>
+              </w:rPr>
+              <w:t xml:space="preserve">'some', 'none') </w:t>
+            </w:r>
+            <w:r>
+              <w:rPr>
+                <w:shd w:val="clear" w:color="auto" w:fill="FFFFFF"/>
+              </w:rPr>
+              <w:lastRenderedPageBreak/>
+              <w:t>%}</w:t>
             </w:r>
           </w:p>
         </w:tc>
@@ -5462,28 +5373,17 @@
           </w:tcPr>
           <w:p>
             <w:pPr>
-              <w:pStyle w:val="Body"/>
-              <w:spacing w:before="0" w:after="60"/>
-            </w:pPr>
-          </w:p>
-          <w:p>
-            <w:pPr>
-              <w:pStyle w:val="Body"/>
-            </w:pPr>
-            <w:r>
-              <w:t>{{p (include</w:t>
-            </w:r>
-            <w:r>
-              <w:t>_docx_template("docassemble.AKA2JBranding:</w:t>
-            </w:r>
-            <w:r>
+              <w:widowControl w:val="0"/>
               <w:rPr>
                 <w:rFonts w:eastAsia="Calibri"/>
               </w:rPr>
-              <w:t>contact_other_party</w:t>
-            </w:r>
-            <w:r>
-              <w:t>_content.docx")) }}</w:t>
+            </w:pPr>
+            <w:r>
+              <w:rPr>
+                <w:rFonts w:eastAsia="Calibri"/>
+              </w:rPr>
+              <w:lastRenderedPageBreak/>
+              <w:t>appeal_response_step in aka2j_motion_response_templates.yml</w:t>
             </w:r>
           </w:p>
         </w:tc>
@@ -5514,7 +5414,7 @@
               <w:rPr>
                 <w:shd w:val="clear" w:color="auto" w:fill="FFFFFF"/>
               </w:rPr>
-              <w:t>{{ file_agreement_step.subject }}</w:t>
+              <w:t>{{ appeal_response_step.subject }}</w:t>
             </w:r>
           </w:p>
         </w:tc>
@@ -5542,13 +5442,16 @@
               <w:pStyle w:val="Body"/>
             </w:pPr>
             <w:r>
-              <w:t>{{p (include</w:t>
-            </w:r>
-            <w:r>
-              <w:t>_docx_template("docassemble.AKA2JBranding:</w:t>
-            </w:r>
-            <w:r>
-              <w:t>file_agreement</w:t>
+              <w:t xml:space="preserve">{{p </w:t>
+            </w:r>
+            <w:r>
+              <w:t>(include_docx_template("docassemble.AKA2JBranding:</w:t>
+            </w:r>
+            <w:r>
+              <w:rPr>
+                <w:shd w:val="clear" w:color="auto" w:fill="FFFFFF"/>
+              </w:rPr>
+              <w:t>appeal_response</w:t>
             </w:r>
             <w:r>
               <w:t>_content.docx")) }}</w:t>
@@ -5633,20 +5536,7 @@
               <w:rPr>
                 <w:shd w:val="clear" w:color="auto" w:fill="FFFFFF"/>
               </w:rPr>
-              <w:lastRenderedPageBreak/>
-              <w:t>{%tr if respond_to_appeal in ('agree',</w:t>
-            </w:r>
-            <w:r>
-              <w:rPr>
-                <w:shd w:val="clear" w:color="auto" w:fill="FFFFFF"/>
-              </w:rPr>
-              <w:t xml:space="preserve"> </w:t>
-            </w:r>
-            <w:r>
-              <w:rPr>
-                <w:shd w:val="clear" w:color="auto" w:fill="FFFFFF"/>
-              </w:rPr>
-              <w:t>'some', 'none') %}</w:t>
+              <w:t>{%tr if respond_to_appeal == 'agree' %}</w:t>
             </w:r>
           </w:p>
         </w:tc>
@@ -5665,16 +5555,13 @@
           </w:tcPr>
           <w:p>
             <w:pPr>
-              <w:widowControl w:val="0"/>
-              <w:rPr>
-                <w:rFonts w:eastAsia="Calibri"/>
-              </w:rPr>
-            </w:pPr>
-            <w:r>
-              <w:rPr>
-                <w:rFonts w:eastAsia="Calibri"/>
-              </w:rPr>
-              <w:t>appeal_response_step in aka2j_motion_response_templates.yml</w:t>
+              <w:pStyle w:val="Body"/>
+              <w:rPr>
+                <w:shd w:val="clear" w:color="auto" w:fill="FFFFFF"/>
+              </w:rPr>
+            </w:pPr>
+            <w:r>
+              <w:t>appeal_contact_parent_step and tell_supreme_court_step in aka2j_motion_response_templates.yml</w:t>
             </w:r>
           </w:p>
         </w:tc>
@@ -5705,7 +5592,16 @@
               <w:rPr>
                 <w:shd w:val="clear" w:color="auto" w:fill="FFFFFF"/>
               </w:rPr>
-              <w:t>{{ appeal_response_step.subject }}</w:t>
+              <w:t xml:space="preserve">{{ </w:t>
+            </w:r>
+            <w:r>
+              <w:t>appeal_contact_parent_step.subject</w:t>
+            </w:r>
+            <w:r>
+              <w:rPr>
+                <w:shd w:val="clear" w:color="auto" w:fill="FFFFFF"/>
+              </w:rPr>
+              <w:t xml:space="preserve"> }}</w:t>
             </w:r>
           </w:p>
         </w:tc>
@@ -5742,7 +5638,7 @@
               <w:rPr>
                 <w:shd w:val="clear" w:color="auto" w:fill="FFFFFF"/>
               </w:rPr>
-              <w:t>appeal_response</w:t>
+              <w:t>appeal_contact_parent</w:t>
             </w:r>
             <w:r>
               <w:t>_content.docx")) }}</w:t>
@@ -5766,16 +5662,29 @@
           </w:tcPr>
           <w:p>
             <w:pPr>
-              <w:pStyle w:val="Body"/>
-              <w:rPr>
-                <w:shd w:val="clear" w:color="auto" w:fill="FFFFFF"/>
-              </w:rPr>
-            </w:pPr>
-            <w:r>
-              <w:rPr>
-                <w:shd w:val="clear" w:color="auto" w:fill="FFFFFF"/>
-              </w:rPr>
-              <w:t>{%tr endif %}</w:t>
+              <w:pStyle w:val="Heading2"/>
+              <w:outlineLvl w:val="1"/>
+              <w:rPr>
+                <w:shd w:val="clear" w:color="auto" w:fill="FFFFFF"/>
+              </w:rPr>
+            </w:pPr>
+            <w:r>
+              <w:rPr>
+                <w:shd w:val="clear" w:color="auto" w:fill="FFFFFF"/>
+              </w:rPr>
+              <w:t xml:space="preserve">{{ </w:t>
+            </w:r>
+            <w:r>
+              <w:t>tell_supreme_court_step</w:t>
+            </w:r>
+            <w:r>
+              <w:t>.subject</w:t>
+            </w:r>
+            <w:r>
+              <w:rPr>
+                <w:shd w:val="clear" w:color="auto" w:fill="FFFFFF"/>
+              </w:rPr>
+              <w:t xml:space="preserve"> }}</w:t>
             </w:r>
           </w:p>
         </w:tc>
@@ -5794,11 +5703,32 @@
           </w:tcPr>
           <w:p>
             <w:pPr>
-              <w:widowControl w:val="0"/>
-              <w:rPr>
-                <w:rFonts w:eastAsia="Calibri"/>
-              </w:rPr>
-            </w:pPr>
+              <w:pStyle w:val="Body"/>
+              <w:suppressAutoHyphens w:val="0"/>
+              <w:autoSpaceDE w:val="0"/>
+              <w:autoSpaceDN w:val="0"/>
+              <w:spacing w:before="0" w:after="60"/>
+              <w:rPr>
+                <w:color w:val="auto"/>
+                <w:spacing w:val="0"/>
+              </w:rPr>
+            </w:pPr>
+          </w:p>
+          <w:p>
+            <w:pPr>
+              <w:pStyle w:val="Body"/>
+              <w:suppressAutoHyphens w:val="0"/>
+              <w:autoSpaceDE w:val="0"/>
+              <w:autoSpaceDN w:val="0"/>
+              <w:spacing w:before="0" w:after="60"/>
+            </w:pPr>
+            <w:r>
+              <w:rPr>
+                <w:color w:val="auto"/>
+                <w:spacing w:val="0"/>
+              </w:rPr>
+              <w:t>{{p (include_docx_template("docassemble.AKA2JBranding:tell_supreme_court_content.docx")) }}</w:t>
+            </w:r>
           </w:p>
         </w:tc>
       </w:tr>
@@ -5827,7 +5757,7 @@
               <w:rPr>
                 <w:shd w:val="clear" w:color="auto" w:fill="FFFFFF"/>
               </w:rPr>
-              <w:t>{%tr if respond_to_appeal == 'agree' %}</w:t>
+              <w:t>{%tr endif %}</w:t>
             </w:r>
           </w:p>
         </w:tc>
@@ -5846,13 +5776,16 @@
           </w:tcPr>
           <w:p>
             <w:pPr>
-              <w:pStyle w:val="Body"/>
-              <w:rPr>
-                <w:shd w:val="clear" w:color="auto" w:fill="FFFFFF"/>
-              </w:rPr>
-            </w:pPr>
-            <w:r>
-              <w:t>appeal_contact_parent_step and tell_supreme_court_step in aka2j_motion_response_templates.yml</w:t>
+              <w:widowControl w:val="0"/>
+              <w:rPr>
+                <w:rFonts w:eastAsia="Calibri"/>
+              </w:rPr>
+            </w:pPr>
+            <w:r>
+              <w:rPr>
+                <w:rFonts w:eastAsia="Calibri"/>
+              </w:rPr>
+              <w:t>get_help in aka2j_templates.yml</w:t>
             </w:r>
           </w:p>
         </w:tc>
@@ -5875,24 +5808,9 @@
             <w:pPr>
               <w:pStyle w:val="Heading2"/>
               <w:outlineLvl w:val="1"/>
-              <w:rPr>
-                <w:shd w:val="clear" w:color="auto" w:fill="FFFFFF"/>
-              </w:rPr>
-            </w:pPr>
-            <w:r>
-              <w:rPr>
-                <w:shd w:val="clear" w:color="auto" w:fill="FFFFFF"/>
-              </w:rPr>
-              <w:t xml:space="preserve">{{ </w:t>
-            </w:r>
-            <w:r>
-              <w:t>appeal_contact_parent_step.subject</w:t>
-            </w:r>
-            <w:r>
-              <w:rPr>
-                <w:shd w:val="clear" w:color="auto" w:fill="FFFFFF"/>
-              </w:rPr>
-              <w:t xml:space="preserve"> }}</w:t>
+            </w:pPr>
+            <w:r>
+              <w:t>{{ get_help.subject }}</w:t>
             </w:r>
           </w:p>
         </w:tc>
@@ -5912,12 +5830,9 @@
           <w:p>
             <w:pPr>
               <w:pStyle w:val="Body"/>
-              <w:spacing w:before="0" w:after="60"/>
-            </w:pPr>
-          </w:p>
-          <w:p>
-            <w:pPr>
-              <w:pStyle w:val="Body"/>
+              <w:rPr>
+                <w:rFonts w:eastAsia="Calibri"/>
+              </w:rPr>
             </w:pPr>
             <w:r>
               <w:t xml:space="preserve">{{p </w:t>
@@ -5926,225 +5841,10 @@
               <w:t>(include_docx_template("docassemble.AKA2JBranding:</w:t>
             </w:r>
             <w:r>
-              <w:rPr>
-                <w:shd w:val="clear" w:color="auto" w:fill="FFFFFF"/>
-              </w:rPr>
-              <w:t>appeal_contact_parent</w:t>
+              <w:t>get_help</w:t>
             </w:r>
             <w:r>
               <w:t>_content.docx")) }}</w:t>
-            </w:r>
-          </w:p>
-        </w:tc>
-      </w:tr>
-      <w:tr>
-        <w:trPr>
-          <w:jc w:val="center"/>
-        </w:trPr>
-        <w:tc>
-          <w:tcPr>
-            <w:tcW w:w="2880" w:type="dxa"/>
-            <w:tcBorders>
-              <w:top w:val="nil"/>
-              <w:left w:val="nil"/>
-              <w:bottom w:val="nil"/>
-              <w:right w:val="nil"/>
-            </w:tcBorders>
-          </w:tcPr>
-          <w:p>
-            <w:pPr>
-              <w:pStyle w:val="Heading2"/>
-              <w:outlineLvl w:val="1"/>
-              <w:rPr>
-                <w:shd w:val="clear" w:color="auto" w:fill="FFFFFF"/>
-              </w:rPr>
-            </w:pPr>
-            <w:r>
-              <w:rPr>
-                <w:shd w:val="clear" w:color="auto" w:fill="FFFFFF"/>
-              </w:rPr>
-              <w:t xml:space="preserve">{{ </w:t>
-            </w:r>
-            <w:r>
-              <w:t>tell_supreme_court_step</w:t>
-            </w:r>
-            <w:r>
-              <w:t>.subject</w:t>
-            </w:r>
-            <w:r>
-              <w:rPr>
-                <w:shd w:val="clear" w:color="auto" w:fill="FFFFFF"/>
-              </w:rPr>
-              <w:t xml:space="preserve"> }}</w:t>
-            </w:r>
-          </w:p>
-        </w:tc>
-        <w:tc>
-          <w:tcPr>
-            <w:tcW w:w="7612" w:type="dxa"/>
-            <w:tcBorders>
-              <w:top w:val="nil"/>
-              <w:left w:val="nil"/>
-              <w:bottom w:val="nil"/>
-              <w:right w:val="nil"/>
-            </w:tcBorders>
-            <w:tcMar>
-              <w:top w:w="432" w:type="dxa"/>
-            </w:tcMar>
-          </w:tcPr>
-          <w:p>
-            <w:pPr>
-              <w:pStyle w:val="Body"/>
-              <w:suppressAutoHyphens w:val="0"/>
-              <w:autoSpaceDE w:val="0"/>
-              <w:autoSpaceDN w:val="0"/>
-              <w:spacing w:before="0" w:after="60"/>
-              <w:rPr>
-                <w:color w:val="auto"/>
-                <w:spacing w:val="0"/>
-              </w:rPr>
-            </w:pPr>
-          </w:p>
-          <w:p>
-            <w:pPr>
-              <w:pStyle w:val="Body"/>
-              <w:suppressAutoHyphens w:val="0"/>
-              <w:autoSpaceDE w:val="0"/>
-              <w:autoSpaceDN w:val="0"/>
-              <w:spacing w:before="0" w:after="60"/>
-            </w:pPr>
-            <w:r>
-              <w:rPr>
-                <w:color w:val="auto"/>
-                <w:spacing w:val="0"/>
-              </w:rPr>
-              <w:t>{{p (include_docx_template("docassemble.AKA2JBranding:tell_supreme_court_content.docx")) }}</w:t>
-            </w:r>
-          </w:p>
-        </w:tc>
-      </w:tr>
-      <w:tr>
-        <w:trPr>
-          <w:jc w:val="center"/>
-        </w:trPr>
-        <w:tc>
-          <w:tcPr>
-            <w:tcW w:w="2880" w:type="dxa"/>
-            <w:tcBorders>
-              <w:top w:val="nil"/>
-              <w:left w:val="nil"/>
-              <w:bottom w:val="nil"/>
-              <w:right w:val="nil"/>
-            </w:tcBorders>
-          </w:tcPr>
-          <w:p>
-            <w:pPr>
-              <w:pStyle w:val="Body"/>
-              <w:rPr>
-                <w:shd w:val="clear" w:color="auto" w:fill="FFFFFF"/>
-              </w:rPr>
-            </w:pPr>
-            <w:r>
-              <w:rPr>
-                <w:shd w:val="clear" w:color="auto" w:fill="FFFFFF"/>
-              </w:rPr>
-              <w:t>{%tr endif %}</w:t>
-            </w:r>
-          </w:p>
-        </w:tc>
-        <w:tc>
-          <w:tcPr>
-            <w:tcW w:w="7612" w:type="dxa"/>
-            <w:tcBorders>
-              <w:top w:val="nil"/>
-              <w:left w:val="nil"/>
-              <w:bottom w:val="nil"/>
-              <w:right w:val="nil"/>
-            </w:tcBorders>
-            <w:tcMar>
-              <w:top w:w="432" w:type="dxa"/>
-            </w:tcMar>
-          </w:tcPr>
-          <w:p>
-            <w:pPr>
-              <w:widowControl w:val="0"/>
-              <w:rPr>
-                <w:rFonts w:eastAsia="Calibri"/>
-              </w:rPr>
-            </w:pPr>
-            <w:r>
-              <w:rPr>
-                <w:rFonts w:eastAsia="Calibri"/>
-              </w:rPr>
-              <w:t>get_help in aka2j_templates.yml</w:t>
-            </w:r>
-          </w:p>
-        </w:tc>
-      </w:tr>
-      <w:tr>
-        <w:trPr>
-          <w:jc w:val="center"/>
-        </w:trPr>
-        <w:tc>
-          <w:tcPr>
-            <w:tcW w:w="2880" w:type="dxa"/>
-            <w:tcBorders>
-              <w:top w:val="nil"/>
-              <w:left w:val="nil"/>
-              <w:bottom w:val="nil"/>
-              <w:right w:val="nil"/>
-            </w:tcBorders>
-          </w:tcPr>
-          <w:p>
-            <w:pPr>
-              <w:pStyle w:val="Heading2"/>
-              <w:outlineLvl w:val="1"/>
-            </w:pPr>
-            <w:r>
-              <w:t xml:space="preserve">{{ get_help.subject </w:t>
-            </w:r>
-            <w:r>
-              <w:lastRenderedPageBreak/>
-              <w:t>}}</w:t>
-            </w:r>
-          </w:p>
-        </w:tc>
-        <w:tc>
-          <w:tcPr>
-            <w:tcW w:w="7612" w:type="dxa"/>
-            <w:tcBorders>
-              <w:top w:val="nil"/>
-              <w:left w:val="nil"/>
-              <w:bottom w:val="nil"/>
-              <w:right w:val="nil"/>
-            </w:tcBorders>
-            <w:tcMar>
-              <w:top w:w="432" w:type="dxa"/>
-            </w:tcMar>
-          </w:tcPr>
-          <w:p>
-            <w:pPr>
-              <w:pStyle w:val="Body"/>
-              <w:rPr>
-                <w:rFonts w:eastAsia="Calibri"/>
-              </w:rPr>
-            </w:pPr>
-            <w:r>
-              <w:lastRenderedPageBreak/>
-              <w:t xml:space="preserve">{{p </w:t>
-            </w:r>
-            <w:r>
-              <w:t>(include_docx_template("docassemble.AKA2JBranding:</w:t>
-            </w:r>
-            <w:r>
-              <w:t>get_help</w:t>
-            </w:r>
-            <w:r>
-              <w:t>_cont</w:t>
-            </w:r>
-            <w:r>
-              <w:lastRenderedPageBreak/>
-              <w:t>ent.docx")) }}</w:t>
             </w:r>
           </w:p>
         </w:tc>
@@ -6155,7 +5855,6 @@
         <w:spacing w:beforeAutospacing="0" w:afterAutospacing="0"/>
       </w:pPr>
       <w:r>
-        <w:lastRenderedPageBreak/>
         <w:br w:type="textWrapping" w:clear="all"/>
       </w:r>
     </w:p>
@@ -6235,14 +5934,27 @@
     <w:r>
       <w:t xml:space="preserve"> of </w:t>
     </w:r>
-    <w:fldSimple w:instr=" NUMPAGES \* ARABIC ">
-      <w:r>
-        <w:rPr>
-          <w:noProof/>
-        </w:rPr>
-        <w:t>50</w:t>
-      </w:r>
-    </w:fldSimple>
+    <w:r>
+      <w:fldChar w:fldCharType="begin"/>
+    </w:r>
+    <w:r>
+      <w:instrText xml:space="preserve"> NUMPAGES \* ARABIC </w:instrText>
+    </w:r>
+    <w:r>
+      <w:fldChar w:fldCharType="separate"/>
+    </w:r>
+    <w:r>
+      <w:rPr>
+        <w:noProof/>
+      </w:rPr>
+      <w:t>50</w:t>
+    </w:r>
+    <w:r>
+      <w:rPr>
+        <w:noProof/>
+      </w:rPr>
+      <w:fldChar w:fldCharType="end"/>
+    </w:r>
     <w:r>
       <w:t xml:space="preserve"> pages</w:t>
     </w:r>
@@ -6256,10 +5968,7 @@
       <w:t xml:space="preserve">June </w:t>
     </w:r>
     <w:r>
-      <w:t>1</w:t>
-    </w:r>
-    <w:r>
-      <w:t>7</w:t>
+      <w:t>18</w:t>
     </w:r>
     <w:r>
       <w:t>, 202</w:t>
@@ -6297,11 +6006,21 @@
     <w:r>
       <w:t xml:space="preserve"> of </w:t>
     </w:r>
-    <w:fldSimple w:instr=" NUMPAGES \* ARABIC ">
-      <w:r>
-        <w:t>47</w:t>
-      </w:r>
-    </w:fldSimple>
+    <w:r>
+      <w:fldChar w:fldCharType="begin"/>
+    </w:r>
+    <w:r>
+      <w:instrText xml:space="preserve"> NUMPAGES \* ARABIC </w:instrText>
+    </w:r>
+    <w:r>
+      <w:fldChar w:fldCharType="separate"/>
+    </w:r>
+    <w:r>
+      <w:t>47</w:t>
+    </w:r>
+    <w:r>
+      <w:fldChar w:fldCharType="end"/>
+    </w:r>
     <w:r>
       <w:t xml:space="preserve"> pages</w:t>
     </w:r>

</xml_diff>

<commit_message>
Somehow forgot to upload fixed docx yesterday
</commit_message>
<xml_diff>
--- a/docassemble/ChangingChildCustody/data/templates/changing_child_custody_action_plan.docx
+++ b/docassemble/ChangingChildCustody/data/templates/changing_child_custody_action_plan.docx
@@ -534,7 +534,15 @@
               <w:t xml:space="preserve">Your Action Plan in </w:t>
             </w:r>
             <w:r>
-              <w:t>{{ step_list | length }}</w:t>
+              <w:t xml:space="preserve">{{ </w:t>
+            </w:r>
+            <w:proofErr w:type="spellStart"/>
+            <w:r>
+              <w:t>step_list</w:t>
+            </w:r>
+            <w:proofErr w:type="spellEnd"/>
+            <w:r>
+              <w:t xml:space="preserve"> | length }}</w:t>
             </w:r>
             <w:r>
               <w:t xml:space="preserve"> Steps</w:t>
@@ -586,7 +594,23 @@
               <w:pStyle w:val="Body"/>
             </w:pPr>
             <w:r>
-              <w:t>{%tr if parents_agree or final_order_date_within_15_days or (unknown_final_date.true_values())|list|length &gt; 1 %}</w:t>
+              <w:t>{%tr if parents_agree or final_order_date_within_15_days or (</w:t>
+            </w:r>
+            <w:proofErr w:type="spellStart"/>
+            <w:r>
+              <w:t>unknown_final_date.true_values</w:t>
+            </w:r>
+            <w:proofErr w:type="spellEnd"/>
+            <w:r>
+              <w:t>())|</w:t>
+            </w:r>
+            <w:proofErr w:type="spellStart"/>
+            <w:r>
+              <w:t>list|length</w:t>
+            </w:r>
+            <w:proofErr w:type="spellEnd"/>
+            <w:r>
+              <w:t xml:space="preserve"> &gt; 1 %}</w:t>
             </w:r>
           </w:p>
         </w:tc>
@@ -607,8 +631,13 @@
             <w:pPr>
               <w:pStyle w:val="Body"/>
             </w:pPr>
-            <w:r>
-              <w:t>pick_a_step_step in aka2j_templates.yml</w:t>
+            <w:proofErr w:type="spellStart"/>
+            <w:r>
+              <w:t>pick_a_step_step</w:t>
+            </w:r>
+            <w:proofErr w:type="spellEnd"/>
+            <w:r>
+              <w:t xml:space="preserve"> in aka2j_templates.yml</w:t>
             </w:r>
           </w:p>
         </w:tc>
@@ -636,14 +665,22 @@
               <w:t>{{</w:t>
             </w:r>
             <w:r>
-              <w:t xml:space="preserve"> pick_a_step</w:t>
+              <w:t xml:space="preserve"> </w:t>
+            </w:r>
+            <w:proofErr w:type="spellStart"/>
+            <w:r>
+              <w:t>pick_a_step</w:t>
             </w:r>
             <w:r>
               <w:t>_ste</w:t>
             </w:r>
             <w:r>
               <w:lastRenderedPageBreak/>
-              <w:t>p.subject }}</w:t>
+              <w:t>p.subject</w:t>
+            </w:r>
+            <w:proofErr w:type="spellEnd"/>
+            <w:r>
+              <w:t xml:space="preserve"> }}</w:t>
             </w:r>
           </w:p>
         </w:tc>
@@ -770,8 +807,21 @@
             <w:pPr>
               <w:pStyle w:val="Body"/>
             </w:pPr>
-            <w:r>
-              <w:t>parents_agree_step  and tell_the_court_step in aka2j_templates.yml</w:t>
+            <w:proofErr w:type="spellStart"/>
+            <w:r>
+              <w:t>parents_agree_step</w:t>
+            </w:r>
+            <w:proofErr w:type="spellEnd"/>
+            <w:r>
+              <w:t xml:space="preserve">  and </w:t>
+            </w:r>
+            <w:proofErr w:type="spellStart"/>
+            <w:r>
+              <w:t>tell_the_court_step</w:t>
+            </w:r>
+            <w:proofErr w:type="spellEnd"/>
+            <w:r>
+              <w:t xml:space="preserve"> in aka2j_templates.yml</w:t>
             </w:r>
           </w:p>
         </w:tc>
@@ -796,7 +846,15 @@
               <w:outlineLvl w:val="1"/>
             </w:pPr>
             <w:r>
-              <w:t>{{ parents_agree_step.subject }}</w:t>
+              <w:t xml:space="preserve">{{ </w:t>
+            </w:r>
+            <w:proofErr w:type="spellStart"/>
+            <w:r>
+              <w:t>parents_agree_step.subject</w:t>
+            </w:r>
+            <w:proofErr w:type="spellEnd"/>
+            <w:r>
+              <w:t xml:space="preserve"> }}</w:t>
             </w:r>
           </w:p>
         </w:tc>
@@ -855,7 +913,15 @@
               <w:outlineLvl w:val="1"/>
             </w:pPr>
             <w:r>
-              <w:t>{{ tell_the_court_step.subject }}</w:t>
+              <w:t xml:space="preserve">{{ </w:t>
+            </w:r>
+            <w:proofErr w:type="spellStart"/>
+            <w:r>
+              <w:t>tell_the_court_step.subject</w:t>
+            </w:r>
+            <w:proofErr w:type="spellEnd"/>
+            <w:r>
+              <w:t xml:space="preserve"> }}</w:t>
             </w:r>
           </w:p>
         </w:tc>
@@ -980,16 +1046,26 @@
             <w:pPr>
               <w:pStyle w:val="Body"/>
             </w:pPr>
-            <w:r>
-              <w:t>foreign_order_step in aka2j_mod_cust_div_templates.yml</w:t>
-            </w:r>
-          </w:p>
-          <w:p>
-            <w:pPr>
-              <w:pStyle w:val="Body"/>
-            </w:pPr>
-            <w:r>
-              <w:t>ak_jurisdiction_step in aka2j_templates.yml</w:t>
+            <w:proofErr w:type="spellStart"/>
+            <w:r>
+              <w:t>foreign_order_step</w:t>
+            </w:r>
+            <w:proofErr w:type="spellEnd"/>
+            <w:r>
+              <w:t xml:space="preserve"> in aka2j_mod_cust_div_templates.yml</w:t>
+            </w:r>
+          </w:p>
+          <w:p>
+            <w:pPr>
+              <w:pStyle w:val="Body"/>
+            </w:pPr>
+            <w:proofErr w:type="spellStart"/>
+            <w:r>
+              <w:t>ak_jurisdiction_step</w:t>
+            </w:r>
+            <w:proofErr w:type="spellEnd"/>
+            <w:r>
+              <w:t xml:space="preserve"> in aka2j_templates.yml</w:t>
             </w:r>
           </w:p>
           <w:p>
@@ -1024,11 +1100,16 @@
             <w:r>
               <w:t xml:space="preserve">{{ </w:t>
             </w:r>
+            <w:proofErr w:type="spellStart"/>
             <w:r>
               <w:t>foreign_order_step</w:t>
             </w:r>
             <w:r>
-              <w:t>.subject }}</w:t>
+              <w:t>.subject</w:t>
+            </w:r>
+            <w:proofErr w:type="spellEnd"/>
+            <w:r>
+              <w:t xml:space="preserve"> }}</w:t>
             </w:r>
           </w:p>
         </w:tc>
@@ -1085,6 +1166,7 @@
               </w:rPr>
               <w:t xml:space="preserve">{{ </w:t>
             </w:r>
+            <w:proofErr w:type="spellStart"/>
             <w:r>
               <w:rPr>
                 <w:shd w:val="clear" w:color="auto" w:fill="FFFFFF"/>
@@ -1095,7 +1177,14 @@
               <w:rPr>
                 <w:shd w:val="clear" w:color="auto" w:fill="FFFFFF"/>
               </w:rPr>
-              <w:t>.subject }}</w:t>
+              <w:t>.subject</w:t>
+            </w:r>
+            <w:proofErr w:type="spellEnd"/>
+            <w:r>
+              <w:rPr>
+                <w:shd w:val="clear" w:color="auto" w:fill="FFFFFF"/>
+              </w:rPr>
+              <w:t xml:space="preserve"> }}</w:t>
             </w:r>
           </w:p>
         </w:tc>
@@ -1163,6 +1252,7 @@
               <w:lastRenderedPageBreak/>
               <w:t xml:space="preserve">{{ </w:t>
             </w:r>
+            <w:proofErr w:type="spellStart"/>
             <w:r>
               <w:rPr>
                 <w:shd w:val="clear" w:color="auto" w:fill="FFFFFF"/>
@@ -1173,7 +1263,14 @@
               <w:rPr>
                 <w:shd w:val="clear" w:color="auto" w:fill="FFFFFF"/>
               </w:rPr>
-              <w:t>.subject }}</w:t>
+              <w:t>.subject</w:t>
+            </w:r>
+            <w:proofErr w:type="spellEnd"/>
+            <w:r>
+              <w:rPr>
+                <w:shd w:val="clear" w:color="auto" w:fill="FFFFFF"/>
+              </w:rPr>
+              <w:t xml:space="preserve"> }}</w:t>
             </w:r>
           </w:p>
         </w:tc>
@@ -1440,8 +1537,13 @@
             <w:pPr>
               <w:pStyle w:val="Body"/>
             </w:pPr>
-            <w:r>
-              <w:t>modify_step in aka2j_mod_cust_div_templates.yml</w:t>
+            <w:proofErr w:type="spellStart"/>
+            <w:r>
+              <w:t>modify_step</w:t>
+            </w:r>
+            <w:proofErr w:type="spellEnd"/>
+            <w:r>
+              <w:t xml:space="preserve"> in aka2j_mod_cust_div_templates.yml</w:t>
             </w:r>
           </w:p>
           <w:p>
@@ -1476,12 +1578,20 @@
               </w:rPr>
               <w:t xml:space="preserve">{{ </w:t>
             </w:r>
+            <w:proofErr w:type="spellStart"/>
             <w:r>
               <w:rPr>
                 <w:shd w:val="clear" w:color="auto" w:fill="FFFFFF"/>
               </w:rPr>
               <w:lastRenderedPageBreak/>
-              <w:t>modify_step.subject }}</w:t>
+              <w:t>modify_step.subject</w:t>
+            </w:r>
+            <w:proofErr w:type="spellEnd"/>
+            <w:r>
+              <w:rPr>
+                <w:shd w:val="clear" w:color="auto" w:fill="FFFFFF"/>
+              </w:rPr>
+              <w:t xml:space="preserve"> }}</w:t>
             </w:r>
           </w:p>
         </w:tc>
@@ -1710,16 +1820,26 @@
             <w:pPr>
               <w:pStyle w:val="Body"/>
             </w:pPr>
-            <w:r>
-              <w:t>fill_modify_step in aka2j_mod_cust_div_templates.yml</w:t>
-            </w:r>
-          </w:p>
-          <w:p>
-            <w:pPr>
-              <w:pStyle w:val="Body"/>
-            </w:pPr>
-            <w:r>
-              <w:t>calculate_child_support_step in aka2j_templates.yml</w:t>
+            <w:proofErr w:type="spellStart"/>
+            <w:r>
+              <w:t>fill_modify_step</w:t>
+            </w:r>
+            <w:proofErr w:type="spellEnd"/>
+            <w:r>
+              <w:t xml:space="preserve"> in aka2j_mod_cust_div_templates.yml</w:t>
+            </w:r>
+          </w:p>
+          <w:p>
+            <w:pPr>
+              <w:pStyle w:val="Body"/>
+            </w:pPr>
+            <w:proofErr w:type="spellStart"/>
+            <w:r>
+              <w:t>calculate_child_support_step</w:t>
+            </w:r>
+            <w:proofErr w:type="spellEnd"/>
+            <w:r>
+              <w:t xml:space="preserve"> in aka2j_templates.yml</w:t>
             </w:r>
           </w:p>
           <w:p>
@@ -1755,7 +1875,21 @@
               <w:rPr>
                 <w:shd w:val="clear" w:color="auto" w:fill="FFFFFF"/>
               </w:rPr>
-              <w:t>{{ fill_modify_step.subject }}</w:t>
+              <w:t xml:space="preserve">{{ </w:t>
+            </w:r>
+            <w:proofErr w:type="spellStart"/>
+            <w:r>
+              <w:rPr>
+                <w:shd w:val="clear" w:color="auto" w:fill="FFFFFF"/>
+              </w:rPr>
+              <w:t>fill_modify_step.subject</w:t>
+            </w:r>
+            <w:proofErr w:type="spellEnd"/>
+            <w:r>
+              <w:rPr>
+                <w:shd w:val="clear" w:color="auto" w:fill="FFFFFF"/>
+              </w:rPr>
+              <w:t xml:space="preserve"> }}</w:t>
             </w:r>
           </w:p>
         </w:tc>
@@ -1822,12 +1956,14 @@
               </w:rPr>
               <w:t xml:space="preserve">{{ </w:t>
             </w:r>
+            <w:proofErr w:type="spellStart"/>
             <w:r>
               <w:t>calculate_child_support_</w:t>
             </w:r>
             <w:r>
               <w:t>step.subject</w:t>
             </w:r>
+            <w:proofErr w:type="spellEnd"/>
             <w:r>
               <w:rPr>
                 <w:shd w:val="clear" w:color="auto" w:fill="FFFFFF"/>
@@ -1895,11 +2031,16 @@
             <w:r>
               <w:t xml:space="preserve">{{ </w:t>
             </w:r>
+            <w:proofErr w:type="spellStart"/>
             <w:r>
               <w:t>dont_wait_modify_custody_divorce_step</w:t>
             </w:r>
             <w:r>
-              <w:t xml:space="preserve">.subject </w:t>
+              <w:t>.subject</w:t>
+            </w:r>
+            <w:proofErr w:type="spellEnd"/>
+            <w:r>
+              <w:t xml:space="preserve"> </w:t>
             </w:r>
             <w:r>
               <w:lastRenderedPageBreak/>
@@ -2028,8 +2169,21 @@
             <w:pPr>
               <w:pStyle w:val="Body"/>
             </w:pPr>
-            <w:r>
-              <w:t>learn_reconsider_step and fill_reconsider_step in aka2j_mod_cust_div_templates.yml</w:t>
+            <w:proofErr w:type="spellStart"/>
+            <w:r>
+              <w:t>learn_reconsider_step</w:t>
+            </w:r>
+            <w:proofErr w:type="spellEnd"/>
+            <w:r>
+              <w:t xml:space="preserve"> and </w:t>
+            </w:r>
+            <w:proofErr w:type="spellStart"/>
+            <w:r>
+              <w:t>fill_reconsider_step</w:t>
+            </w:r>
+            <w:proofErr w:type="spellEnd"/>
+            <w:r>
+              <w:t xml:space="preserve"> in aka2j_mod_cust_div_templates.yml</w:t>
             </w:r>
           </w:p>
         </w:tc>
@@ -2056,11 +2210,16 @@
             <w:r>
               <w:t xml:space="preserve">{{ </w:t>
             </w:r>
+            <w:proofErr w:type="spellStart"/>
             <w:r>
               <w:t>learn_reconsider_step</w:t>
             </w:r>
             <w:r>
-              <w:t>.subject }}</w:t>
+              <w:t>.subject</w:t>
+            </w:r>
+            <w:proofErr w:type="spellEnd"/>
+            <w:r>
+              <w:t xml:space="preserve"> }}</w:t>
             </w:r>
           </w:p>
         </w:tc>
@@ -2119,13 +2278,21 @@
               <w:outlineLvl w:val="1"/>
             </w:pPr>
             <w:r>
-              <w:t>{{ fill</w:t>
+              <w:t xml:space="preserve">{{ </w:t>
+            </w:r>
+            <w:proofErr w:type="spellStart"/>
+            <w:r>
+              <w:t>fill</w:t>
             </w:r>
             <w:r>
               <w:t>_reconsider_step</w:t>
             </w:r>
             <w:r>
-              <w:t>.subject }}</w:t>
+              <w:t>.subject</w:t>
+            </w:r>
+            <w:proofErr w:type="spellEnd"/>
+            <w:r>
+              <w:t xml:space="preserve"> }}</w:t>
             </w:r>
           </w:p>
         </w:tc>
@@ -2253,14 +2420,19 @@
             <w:pPr>
               <w:pStyle w:val="Body"/>
             </w:pPr>
-            <w:r>
-              <w:t xml:space="preserve">standing_order_step and </w:t>
-            </w:r>
-            <w:r>
-              <w:rPr>
-                <w:shd w:val="clear" w:color="auto" w:fill="FFFFFF"/>
-              </w:rPr>
-              <w:t xml:space="preserve"> motion_forms_step  in aka2j_mod_cust_div_templates.yml</w:t>
+            <w:proofErr w:type="spellStart"/>
+            <w:r>
+              <w:t>standing_order_step</w:t>
+            </w:r>
+            <w:proofErr w:type="spellEnd"/>
+            <w:r>
+              <w:t xml:space="preserve"> and </w:t>
+            </w:r>
+            <w:r>
+              <w:rPr>
+                <w:shd w:val="clear" w:color="auto" w:fill="FFFFFF"/>
+              </w:rPr>
+              <w:t>motion_forms_step  in aka2j_mod_cust_div_templates.yml</w:t>
             </w:r>
           </w:p>
         </w:tc>
@@ -2288,7 +2460,27 @@
               <w:rPr>
                 <w:shd w:val="clear" w:color="auto" w:fill="FFFFFF"/>
               </w:rPr>
-              <w:t>{{ standing_order_step.subject }}</w:t>
+              <w:t xml:space="preserve">{{ </w:t>
+            </w:r>
+            <w:proofErr w:type="spellStart"/>
+            <w:r>
+              <w:rPr>
+                <w:shd w:val="clear" w:color="auto" w:fill="FFFFFF"/>
+              </w:rPr>
+              <w:t>change_</w:t>
+            </w:r>
+            <w:r>
+              <w:rPr>
+                <w:shd w:val="clear" w:color="auto" w:fill="FFFFFF"/>
+              </w:rPr>
+              <w:t>standing_order_step.subject</w:t>
+            </w:r>
+            <w:proofErr w:type="spellEnd"/>
+            <w:r>
+              <w:rPr>
+                <w:shd w:val="clear" w:color="auto" w:fill="FFFFFF"/>
+              </w:rPr>
+              <w:t xml:space="preserve"> }}</w:t>
             </w:r>
           </w:p>
         </w:tc>
@@ -2320,6 +2512,9 @@
             </w:r>
             <w:r>
               <w:t>(include_docx_template("docassemble.AKA2JBranding:</w:t>
+            </w:r>
+            <w:r>
+              <w:t>change_</w:t>
             </w:r>
             <w:r>
               <w:t>standing_order</w:t>
@@ -2691,19 +2886,69 @@
               <w:rPr>
                 <w:color w:val="E056D6"/>
               </w:rPr>
-              <w:t>defined('final_order_period') and guess_final_order_date != 'unknown'</w:t>
-            </w:r>
+              <w:t>defined('</w:t>
+            </w:r>
+            <w:proofErr w:type="spellStart"/>
             <w:r>
               <w:rPr>
                 <w:color w:val="E056D6"/>
               </w:rPr>
+              <w:t>final_order_period</w:t>
+            </w:r>
+            <w:proofErr w:type="spellEnd"/>
+            <w:r>
+              <w:rPr>
+                <w:color w:val="E056D6"/>
+              </w:rPr>
+              <w:t>') and guess_final_order_date != 'unknown'</w:t>
+            </w:r>
+            <w:r>
+              <w:rPr>
+                <w:color w:val="E056D6"/>
+              </w:rPr>
               <w:t>) or (</w:t>
             </w:r>
+            <w:proofErr w:type="spellStart"/>
             <w:r>
               <w:rPr>
                 <w:color w:val="E056D6"/>
               </w:rPr>
-              <w:t xml:space="preserve">final_order_date != '' and date_difference(starting=final_order_date, </w:t>
+              <w:t>final_order_date</w:t>
+            </w:r>
+            <w:proofErr w:type="spellEnd"/>
+            <w:r>
+              <w:rPr>
+                <w:color w:val="E056D6"/>
+              </w:rPr>
+              <w:t xml:space="preserve"> != '' and </w:t>
+            </w:r>
+            <w:proofErr w:type="spellStart"/>
+            <w:r>
+              <w:rPr>
+                <w:color w:val="E056D6"/>
+              </w:rPr>
+              <w:t>date_difference</w:t>
+            </w:r>
+            <w:proofErr w:type="spellEnd"/>
+            <w:r>
+              <w:rPr>
+                <w:color w:val="E056D6"/>
+              </w:rPr>
+              <w:t>(starting=</w:t>
+            </w:r>
+            <w:proofErr w:type="spellStart"/>
+            <w:r>
+              <w:rPr>
+                <w:color w:val="E056D6"/>
+              </w:rPr>
+              <w:t>final_order_date</w:t>
+            </w:r>
+            <w:proofErr w:type="spellEnd"/>
+            <w:r>
+              <w:rPr>
+                <w:color w:val="E056D6"/>
+              </w:rPr>
+              <w:t xml:space="preserve">, </w:t>
             </w:r>
             <w:r>
               <w:rPr>
@@ -2728,7 +2973,21 @@
               <w:rPr>
                 <w:color w:val="E056D6"/>
               </w:rPr>
-              <w:t>defined('final_order_period') and guess_final_order_date == 'unknown'</w:t>
+              <w:t>defined('</w:t>
+            </w:r>
+            <w:proofErr w:type="spellStart"/>
+            <w:r>
+              <w:rPr>
+                <w:color w:val="E056D6"/>
+              </w:rPr>
+              <w:t>final_order_period</w:t>
+            </w:r>
+            <w:proofErr w:type="spellEnd"/>
+            <w:r>
+              <w:rPr>
+                <w:color w:val="E056D6"/>
+              </w:rPr>
+              <w:t>') and guess_final_order_date == 'unknown'</w:t>
             </w:r>
             <w:r>
               <w:rPr>
@@ -2810,7 +3069,6 @@
               <w:rPr>
                 <w:shd w:val="clear" w:color="auto" w:fill="FFFFFF"/>
               </w:rPr>
-              <w:lastRenderedPageBreak/>
               <w:t>{{ learn_set_aside_step.subject }}</w:t>
             </w:r>
           </w:p>
@@ -3909,14 +4167,7 @@
                 <w:color w:val="FF0000"/>
                 <w:shd w:val="clear" w:color="auto" w:fill="FFFFFF"/>
               </w:rPr>
-              <w:t xml:space="preserve"> </w:t>
-            </w:r>
-            <w:r>
-              <w:rPr>
-                <w:color w:val="FF0000"/>
-                <w:shd w:val="clear" w:color="auto" w:fill="FFFFFF"/>
-              </w:rPr>
-              <w:t>or (</w:t>
+              <w:t xml:space="preserve"> or (</w:t>
             </w:r>
             <w:r>
               <w:rPr>
@@ -3979,8 +4230,13 @@
                 <w:shd w:val="clear" w:color="auto" w:fill="FFFFFF"/>
               </w:rPr>
             </w:pPr>
-            <w:r>
-              <w:t>file_motion_step aka2j_templates.yml</w:t>
+            <w:proofErr w:type="spellStart"/>
+            <w:r>
+              <w:t>file_motion_step</w:t>
+            </w:r>
+            <w:proofErr w:type="spellEnd"/>
+            <w:r>
+              <w:t xml:space="preserve"> aka2j_templates.yml</w:t>
             </w:r>
           </w:p>
         </w:tc>
@@ -4198,8 +4454,13 @@
             <w:pPr>
               <w:pStyle w:val="Body"/>
             </w:pPr>
-            <w:r>
-              <w:t>serve_motion_response_step in aka2j_motion_response_templates.yml</w:t>
+            <w:proofErr w:type="spellStart"/>
+            <w:r>
+              <w:t>serve_motion_response_step</w:t>
+            </w:r>
+            <w:proofErr w:type="spellEnd"/>
+            <w:r>
+              <w:t xml:space="preserve"> in aka2j_motion_response_templates.yml</w:t>
             </w:r>
           </w:p>
         </w:tc>
@@ -4390,8 +4651,13 @@
               </w:rPr>
               <w:t>(</w:t>
             </w:r>
-            <w:r>
-              <w:t>unknown_final_date.true_values()</w:t>
+            <w:proofErr w:type="spellStart"/>
+            <w:r>
+              <w:t>unknown_final_date.true_values</w:t>
+            </w:r>
+            <w:proofErr w:type="spellEnd"/>
+            <w:r>
+              <w:t>()</w:t>
             </w:r>
             <w:r>
               <w:rPr>
@@ -4400,7 +4666,15 @@
               <w:t>)</w:t>
             </w:r>
             <w:r>
-              <w:t xml:space="preserve">|list|length == 1 </w:t>
+              <w:t>|</w:t>
+            </w:r>
+            <w:proofErr w:type="spellStart"/>
+            <w:r>
+              <w:t>list|length</w:t>
+            </w:r>
+            <w:proofErr w:type="spellEnd"/>
+            <w:r>
+              <w:t xml:space="preserve"> == 1 </w:t>
             </w:r>
             <w:r>
               <w:rPr>
@@ -4448,8 +4722,13 @@
               </w:rPr>
               <w:t>(</w:t>
             </w:r>
-            <w:r>
-              <w:t>unknown_final_date.true_values()</w:t>
+            <w:proofErr w:type="spellStart"/>
+            <w:r>
+              <w:t>unknown_final_date.true_values</w:t>
+            </w:r>
+            <w:proofErr w:type="spellEnd"/>
+            <w:r>
+              <w:t>()</w:t>
             </w:r>
             <w:r>
               <w:rPr>
@@ -4458,7 +4737,15 @@
               <w:t>)</w:t>
             </w:r>
             <w:r>
-              <w:t xml:space="preserve">|list|length &gt;= 2 </w:t>
+              <w:t>|</w:t>
+            </w:r>
+            <w:proofErr w:type="spellStart"/>
+            <w:r>
+              <w:t>list|length</w:t>
+            </w:r>
+            <w:proofErr w:type="spellEnd"/>
+            <w:r>
+              <w:t xml:space="preserve"> &gt;= 2 </w:t>
             </w:r>
             <w:r>
               <w:rPr>
@@ -4503,9 +4790,14 @@
             <w:pPr>
               <w:pStyle w:val="Body"/>
             </w:pPr>
+            <w:proofErr w:type="spellStart"/>
             <w:r>
               <w:lastRenderedPageBreak/>
-              <w:t>expect_after_motion_step in aka2j_mod_cust_div_templates.yml</w:t>
+              <w:t>expect_after_motion_step</w:t>
+            </w:r>
+            <w:proofErr w:type="spellEnd"/>
+            <w:r>
+              <w:t xml:space="preserve"> in aka2j_mod_cust_div_templates.yml</w:t>
             </w:r>
           </w:p>
         </w:tc>
@@ -4538,11 +4830,16 @@
               </w:rPr>
               <w:t xml:space="preserve">{{ </w:t>
             </w:r>
+            <w:proofErr w:type="spellStart"/>
             <w:r>
               <w:t>expect_after_motion_or_answer</w:t>
             </w:r>
             <w:r>
-              <w:t>_step.subject }}</w:t>
+              <w:t>_step.subject</w:t>
+            </w:r>
+            <w:proofErr w:type="spellEnd"/>
+            <w:r>
+              <w:t xml:space="preserve"> }}</w:t>
             </w:r>
           </w:p>
         </w:tc>
@@ -4685,11 +4982,19 @@
                 <w:rFonts w:eastAsia="Calibri"/>
               </w:rPr>
             </w:pPr>
+            <w:proofErr w:type="spellStart"/>
             <w:r>
               <w:rPr>
                 <w:rFonts w:eastAsia="Calibri"/>
               </w:rPr>
-              <w:t>expect_reconsider_step in aka2j_mod_cust_div_templates.yml</w:t>
+              <w:t>expect_reconsider_step</w:t>
+            </w:r>
+            <w:proofErr w:type="spellEnd"/>
+            <w:r>
+              <w:rPr>
+                <w:rFonts w:eastAsia="Calibri"/>
+              </w:rPr>
+              <w:t xml:space="preserve"> in aka2j_mod_cust_div_templates.yml</w:t>
             </w:r>
           </w:p>
         </w:tc>
@@ -4716,11 +5021,16 @@
             <w:r>
               <w:t xml:space="preserve">{{ </w:t>
             </w:r>
+            <w:proofErr w:type="spellStart"/>
             <w:r>
               <w:t>expect_reconsider_step</w:t>
             </w:r>
             <w:r>
-              <w:t>.subject }}</w:t>
+              <w:t>.subject</w:t>
+            </w:r>
+            <w:proofErr w:type="spellEnd"/>
+            <w:r>
+              <w:t xml:space="preserve"> }}</w:t>
             </w:r>
           </w:p>
         </w:tc>
@@ -4888,13 +5198,22 @@
                 <w:rFonts w:eastAsia="Calibri"/>
               </w:rPr>
             </w:pPr>
+            <w:proofErr w:type="spellStart"/>
             <w:r>
               <w:rPr>
                 <w:rFonts w:eastAsia="Calibri"/>
                 <w:shd w:val="clear" w:color="auto" w:fill="FFFFFF"/>
               </w:rPr>
               <w:lastRenderedPageBreak/>
-              <w:t>expect_after_response_step in aka2j_motion_response_templates.yml</w:t>
+              <w:t>expect_after_response_step</w:t>
+            </w:r>
+            <w:proofErr w:type="spellEnd"/>
+            <w:r>
+              <w:rPr>
+                <w:rFonts w:eastAsia="Calibri"/>
+                <w:shd w:val="clear" w:color="auto" w:fill="FFFFFF"/>
+              </w:rPr>
+              <w:t xml:space="preserve"> in aka2j_motion_response_templates.yml</w:t>
             </w:r>
           </w:p>
         </w:tc>
@@ -4927,6 +5246,7 @@
               </w:rPr>
               <w:t xml:space="preserve">{{ </w:t>
             </w:r>
+            <w:proofErr w:type="spellStart"/>
             <w:r>
               <w:rPr>
                 <w:shd w:val="clear" w:color="auto" w:fill="FFFFFF"/>
@@ -4937,7 +5257,14 @@
               <w:rPr>
                 <w:shd w:val="clear" w:color="auto" w:fill="FFFFFF"/>
               </w:rPr>
-              <w:t>.subject }}</w:t>
+              <w:t>.subject</w:t>
+            </w:r>
+            <w:proofErr w:type="spellEnd"/>
+            <w:r>
+              <w:rPr>
+                <w:shd w:val="clear" w:color="auto" w:fill="FFFFFF"/>
+              </w:rPr>
+              <w:t xml:space="preserve"> }}</w:t>
             </w:r>
           </w:p>
         </w:tc>
@@ -5135,12 +5462,14 @@
               </w:rPr>
               <w:t xml:space="preserve">{{ </w:t>
             </w:r>
+            <w:proofErr w:type="spellStart"/>
             <w:r>
               <w:rPr>
                 <w:rFonts w:eastAsia="Calibri"/>
               </w:rPr>
               <w:t>contact_other_party_step.subject</w:t>
             </w:r>
+            <w:proofErr w:type="spellEnd"/>
             <w:r>
               <w:rPr>
                 <w:shd w:val="clear" w:color="auto" w:fill="FFFFFF"/>
@@ -5378,12 +5707,20 @@
                 <w:rFonts w:eastAsia="Calibri"/>
               </w:rPr>
             </w:pPr>
+            <w:proofErr w:type="spellStart"/>
             <w:r>
               <w:rPr>
                 <w:rFonts w:eastAsia="Calibri"/>
               </w:rPr>
               <w:lastRenderedPageBreak/>
-              <w:t>appeal_response_step in aka2j_motion_response_templates.yml</w:t>
+              <w:t>appeal_response_step</w:t>
+            </w:r>
+            <w:proofErr w:type="spellEnd"/>
+            <w:r>
+              <w:rPr>
+                <w:rFonts w:eastAsia="Calibri"/>
+              </w:rPr>
+              <w:t xml:space="preserve"> in aka2j_motion_response_templates.yml</w:t>
             </w:r>
           </w:p>
         </w:tc>
@@ -5674,12 +6011,14 @@
               </w:rPr>
               <w:t xml:space="preserve">{{ </w:t>
             </w:r>
+            <w:proofErr w:type="spellStart"/>
             <w:r>
               <w:t>tell_supreme_court_step</w:t>
             </w:r>
             <w:r>
               <w:t>.subject</w:t>
             </w:r>
+            <w:proofErr w:type="spellEnd"/>
             <w:r>
               <w:rPr>
                 <w:shd w:val="clear" w:color="auto" w:fill="FFFFFF"/>
@@ -5781,11 +6120,19 @@
                 <w:rFonts w:eastAsia="Calibri"/>
               </w:rPr>
             </w:pPr>
+            <w:proofErr w:type="spellStart"/>
             <w:r>
               <w:rPr>
                 <w:rFonts w:eastAsia="Calibri"/>
               </w:rPr>
-              <w:t>get_help in aka2j_templates.yml</w:t>
+              <w:t>get_help</w:t>
+            </w:r>
+            <w:proofErr w:type="spellEnd"/>
+            <w:r>
+              <w:rPr>
+                <w:rFonts w:eastAsia="Calibri"/>
+              </w:rPr>
+              <w:t xml:space="preserve"> in aka2j_templates.yml</w:t>
             </w:r>
           </w:p>
         </w:tc>
@@ -5810,7 +6157,15 @@
               <w:outlineLvl w:val="1"/>
             </w:pPr>
             <w:r>
-              <w:t>{{ get_help.subject }}</w:t>
+              <w:t xml:space="preserve">{{ </w:t>
+            </w:r>
+            <w:proofErr w:type="spellStart"/>
+            <w:r>
+              <w:t>get_help.subject</w:t>
+            </w:r>
+            <w:proofErr w:type="spellEnd"/>
+            <w:r>
+              <w:t xml:space="preserve"> }}</w:t>
             </w:r>
           </w:p>
         </w:tc>
@@ -5965,10 +6320,16 @@
       <w:spacing w:beforeAutospacing="0" w:afterAutospacing="0"/>
     </w:pPr>
     <w:r>
-      <w:t xml:space="preserve">June </w:t>
+      <w:t>August</w:t>
     </w:r>
     <w:r>
-      <w:t>18</w:t>
+      <w:t xml:space="preserve"> </w:t>
+    </w:r>
+    <w:r>
+      <w:t>1</w:t>
+    </w:r>
+    <w:r>
+      <w:t>2</w:t>
     </w:r>
     <w:r>
       <w:t>, 202</w:t>

</xml_diff>

<commit_message>
Fixed condition for sign step in docx template
</commit_message>
<xml_diff>
--- a/docassemble/ChangingChildCustody/data/templates/changing_child_custody_action_plan.docx
+++ b/docassemble/ChangingChildCustody/data/templates/changing_child_custody_action_plan.docx
@@ -2829,19 +2829,7 @@
               </w:rPr>
             </w:pPr>
             <w:r>
-              <w:t xml:space="preserve">{%tr if user_need == </w:t>
-            </w:r>
-            <w:r>
-              <w:t>‘</w:t>
-            </w:r>
-            <w:r>
-              <w:t>change custody order</w:t>
-            </w:r>
-            <w:r>
-              <w:t xml:space="preserve">’ </w:t>
-            </w:r>
-            <w:r>
-              <w:t xml:space="preserve">and </w:t>
+              <w:t xml:space="preserve">{%tr if user_need == ‘change custody order’ and </w:t>
             </w:r>
             <w:r>
               <w:rPr>
@@ -2859,16 +2847,7 @@
               <w:t>(</w:t>
             </w:r>
             <w:r>
-              <w:t>final_order_date_within_1</w:t>
-            </w:r>
-            <w:r>
-              <w:t>5</w:t>
-            </w:r>
-            <w:r>
-              <w:t>_days</w:t>
-            </w:r>
-            <w:r>
-              <w:t xml:space="preserve"> </w:t>
+              <w:t xml:space="preserve">final_order_date_within_15_days </w:t>
             </w:r>
             <w:r>
               <w:rPr>
@@ -2961,13 +2940,7 @@
               <w:rPr>
                 <w:color w:val="E056D6"/>
               </w:rPr>
-              <w:t>)</w:t>
-            </w:r>
-            <w:r>
-              <w:rPr>
-                <w:color w:val="E056D6"/>
-              </w:rPr>
-              <w:t xml:space="preserve"> or (</w:t>
+              <w:t>) or (</w:t>
             </w:r>
             <w:r>
               <w:rPr>
@@ -3039,10 +3012,6 @@
                 <w:color w:val="auto"/>
               </w:rPr>
             </w:pPr>
-            <w:r>
-              <w:lastRenderedPageBreak/>
-              <w:t>learn_set_aside_step and fill_set_aside_step in aka2j_mod_cust_div_templates.yml</w:t>
-            </w:r>
           </w:p>
         </w:tc>
       </w:tr>
@@ -3066,10 +3035,13 @@
               <w:outlineLvl w:val="1"/>
             </w:pPr>
             <w:r>
-              <w:rPr>
-                <w:shd w:val="clear" w:color="auto" w:fill="FFFFFF"/>
-              </w:rPr>
-              <w:t>{{ learn_set_aside_step.subject }}</w:t>
+              <w:t xml:space="preserve">{{ </w:t>
+            </w:r>
+            <w:r>
+              <w:t>learn_set_aside_step</w:t>
+            </w:r>
+            <w:r>
+              <w:t>.subject }}</w:t>
             </w:r>
           </w:p>
         </w:tc>
@@ -3089,24 +3061,21 @@
           <w:p>
             <w:pPr>
               <w:pStyle w:val="Body"/>
-              <w:spacing w:before="0" w:after="60"/>
-            </w:pPr>
-          </w:p>
-          <w:p>
-            <w:pPr>
-              <w:pStyle w:val="Body"/>
-            </w:pPr>
-            <w:r>
-              <w:t>{{p</w:t>
-            </w:r>
-            <w:r>
-              <w:t xml:space="preserve"> (include_docx_template("docassemble.AKA2JBranding:</w:t>
-            </w:r>
-            <w:r>
-              <w:t>learn_set_aside</w:t>
-            </w:r>
-            <w:r>
-              <w:t>_content.docx")) }}</w:t>
+            </w:pPr>
+            <w:r>
+              <w:t xml:space="preserve">{{p </w:t>
+            </w:r>
+            <w:r>
+              <w:t>(include_docx_template("docassemble.AKA2JBranding:</w:t>
+            </w:r>
+            <w:r>
+              <w:rPr>
+                <w:shd w:val="clear" w:color="auto" w:fill="FFFFFF"/>
+              </w:rPr>
+              <w:t>learn_set_aside_content.docx</w:t>
+            </w:r>
+            <w:r>
+              <w:t>")) }}</w:t>
             </w:r>
           </w:p>
         </w:tc>
@@ -3131,10 +3100,13 @@
               <w:outlineLvl w:val="1"/>
             </w:pPr>
             <w:r>
-              <w:rPr>
-                <w:shd w:val="clear" w:color="auto" w:fill="FFFFFF"/>
-              </w:rPr>
-              <w:t>{{ fill_set_aside_step.subject }}</w:t>
+              <w:t xml:space="preserve">{{ </w:t>
+            </w:r>
+            <w:r>
+              <w:t>fill_set_aside_step</w:t>
+            </w:r>
+            <w:r>
+              <w:t>.subject }}</w:t>
             </w:r>
           </w:p>
         </w:tc>
@@ -3154,12 +3126,6 @@
           <w:p>
             <w:pPr>
               <w:pStyle w:val="Body"/>
-              <w:spacing w:before="0" w:after="60"/>
-            </w:pPr>
-          </w:p>
-          <w:p>
-            <w:pPr>
-              <w:pStyle w:val="Body"/>
             </w:pPr>
             <w:r>
               <w:t xml:space="preserve">{{p </w:t>
@@ -3168,10 +3134,19 @@
               <w:t>(include_docx_template("docassemble.AKA2JBranding:</w:t>
             </w:r>
             <w:r>
-              <w:t>fill_set_aside</w:t>
-            </w:r>
-            <w:r>
-              <w:t>_content.docx")) }}</w:t>
+              <w:rPr>
+                <w:shd w:val="clear" w:color="auto" w:fill="FFFFFF"/>
+              </w:rPr>
+              <w:t>fill</w:t>
+            </w:r>
+            <w:r>
+              <w:rPr>
+                <w:shd w:val="clear" w:color="auto" w:fill="FFFFFF"/>
+              </w:rPr>
+              <w:t>_set_aside_content.docx</w:t>
+            </w:r>
+            <w:r>
+              <w:t>")) }}</w:t>
             </w:r>
           </w:p>
         </w:tc>
@@ -3195,9 +3170,6 @@
               <w:pStyle w:val="Body"/>
             </w:pPr>
             <w:r>
-              <w:rPr>
-                <w:shd w:val="clear" w:color="auto" w:fill="FFFFFF"/>
-              </w:rPr>
               <w:t>{%tr endif %}</w:t>
             </w:r>
           </w:p>
@@ -3822,89 +3794,107 @@
             </w:pPr>
             <w:r>
               <w:rPr>
-                <w:shd w:val="clear" w:color="auto" w:fill="FFFFFF"/>
-              </w:rPr>
-              <w:t xml:space="preserve">{%tr if user_need == 'change foreign custody order' </w:t>
-            </w:r>
-            <w:r>
-              <w:rPr>
                 <w:color w:val="FF0000"/>
                 <w:shd w:val="clear" w:color="auto" w:fill="FFFFFF"/>
               </w:rPr>
-              <w:t>or</w:t>
-            </w:r>
-            <w:r>
-              <w:rPr>
-                <w:shd w:val="clear" w:color="auto" w:fill="FFFFFF"/>
-              </w:rPr>
-              <w:t xml:space="preserve"> </w:t>
+              <w:t>{%tr i</w:t>
             </w:r>
             <w:r>
               <w:rPr>
                 <w:color w:val="FF0000"/>
                 <w:shd w:val="clear" w:color="auto" w:fill="FFFFFF"/>
               </w:rPr>
+              <w:t>f (</w:t>
+            </w:r>
+            <w:r>
+              <w:rPr>
+                <w:color w:val="FFC000"/>
+                <w:shd w:val="clear" w:color="auto" w:fill="FFFFFF"/>
+              </w:rPr>
+              <w:t>user_need == 'change foreign custody order' or (</w:t>
+            </w:r>
+            <w:r>
+              <w:rPr>
+                <w:color w:val="92D050"/>
+                <w:shd w:val="clear" w:color="auto" w:fill="FFFFFF"/>
+              </w:rPr>
               <w:t>(</w:t>
             </w:r>
             <w:r>
               <w:rPr>
-                <w:shd w:val="clear" w:color="auto" w:fill="FFFFFF"/>
-              </w:rPr>
-              <w:t>user_need in('change custody order', 'change divorce order') and not unknown_final_date.all_true</w:t>
-            </w:r>
-            <w:r>
-              <w:rPr>
                 <w:color w:val="00B0F0"/>
                 <w:shd w:val="clear" w:color="auto" w:fill="FFFFFF"/>
               </w:rPr>
-              <w:t>(</w:t>
-            </w:r>
-            <w:r>
-              <w:rPr>
-                <w:shd w:val="clear" w:color="auto" w:fill="FFFFFF"/>
-              </w:rPr>
-              <w:t>'appeal', exclusive = True</w:t>
+              <w:t>user_need in('change custody order', 'change divorce order') and not unknown_final_date.all_true('appeal', exclusive = Tru</w:t>
             </w:r>
             <w:r>
               <w:rPr>
                 <w:color w:val="00B0F0"/>
                 <w:shd w:val="clear" w:color="auto" w:fill="FFFFFF"/>
               </w:rPr>
-              <w:t>)</w:t>
-            </w:r>
-            <w:r>
-              <w:rPr>
-                <w:color w:val="FF0000"/>
+              <w:t>e)</w:t>
+            </w:r>
+            <w:r>
+              <w:rPr>
+                <w:color w:val="92D050"/>
                 <w:shd w:val="clear" w:color="auto" w:fill="FFFFFF"/>
               </w:rPr>
               <w:t>) or (</w:t>
             </w:r>
             <w:r>
               <w:rPr>
-                <w:color w:val="000000"/>
+                <w:color w:val="00B0F0"/>
                 <w:shd w:val="clear" w:color="auto" w:fill="FFFFFF"/>
               </w:rPr>
               <w:t>user_need in</w:t>
             </w:r>
             <w:r>
               <w:rPr>
-                <w:color w:val="auto"/>
+                <w:color w:val="00B0F0"/>
               </w:rPr>
               <w:t xml:space="preserve">('respond to motion in </w:t>
             </w:r>
             <w:r>
               <w:rPr>
-                <w:color w:val="auto"/>
+                <w:color w:val="00B0F0"/>
               </w:rPr>
               <w:lastRenderedPageBreak/>
               <w:t>custody', 'respond to motion in divorce')</w:t>
             </w:r>
             <w:r>
               <w:rPr>
-                <w:color w:val="000000"/>
+                <w:color w:val="00B0F0"/>
                 <w:shd w:val="clear" w:color="auto" w:fill="FFFFFF"/>
               </w:rPr>
               <w:t xml:space="preserve"> and type_of_response in('reconsider', 'modify', 'set aside')</w:t>
+            </w:r>
+            <w:r>
+              <w:rPr>
+                <w:color w:val="92D050"/>
+                <w:shd w:val="clear" w:color="auto" w:fill="FFFFFF"/>
+              </w:rPr>
+              <w:t>)</w:t>
+            </w:r>
+            <w:r>
+              <w:rPr>
+                <w:color w:val="FFC000"/>
+                <w:shd w:val="clear" w:color="auto" w:fill="FFFFFF"/>
+              </w:rPr>
+              <w:t>)</w:t>
+            </w:r>
+            <w:r>
+              <w:rPr>
+                <w:color w:val="FF0000"/>
+                <w:shd w:val="clear" w:color="auto" w:fill="FFFFFF"/>
+              </w:rPr>
+              <w:t>) and (</w:t>
+            </w:r>
+            <w:r>
+              <w:rPr>
+                <w:color w:val="FFC000"/>
+                <w:shd w:val="clear" w:color="auto" w:fill="FFFFFF"/>
+              </w:rPr>
+              <w:t>filling_manner in('paper', 'dunno') or filing_method in('mail or in person', 'dunno')</w:t>
             </w:r>
             <w:r>
               <w:rPr>
@@ -4021,7 +4011,13 @@
               </w:rPr>
             </w:pPr>
             <w:r>
-              <w:t>{{ sign_step.subject }}</w:t>
+              <w:t xml:space="preserve">{{ </w:t>
+            </w:r>
+            <w:r>
+              <w:t>sign_step</w:t>
+            </w:r>
+            <w:r>
+              <w:t>.subject }}</w:t>
             </w:r>
           </w:p>
         </w:tc>
@@ -4267,7 +4263,11 @@
               <w:t xml:space="preserve">{{ </w:t>
             </w:r>
             <w:r>
-              <w:t>truefiling_file_and_serve_</w:t>
+              <w:t>truefiling_file_an</w:t>
+            </w:r>
+            <w:r>
+              <w:lastRenderedPageBreak/>
+              <w:t>d_serve_</w:t>
             </w:r>
             <w:r>
               <w:t>step.subject }}</w:t>
@@ -4307,7 +4307,14 @@
               <w:rPr>
                 <w:shd w:val="clear" w:color="auto" w:fill="FFFFFF"/>
               </w:rPr>
-              <w:t>truefiling_file_and_serve_content.docx</w:t>
+              <w:t>truefiling_file_</w:t>
+            </w:r>
+            <w:r>
+              <w:rPr>
+                <w:shd w:val="clear" w:color="auto" w:fill="FFFFFF"/>
+              </w:rPr>
+              <w:lastRenderedPageBreak/>
+              <w:t>and_serve_content.docx</w:t>
             </w:r>
             <w:r>
               <w:t>")) }}</w:t>
@@ -4643,6 +4650,7 @@
               <w:rPr>
                 <w:color w:val="FFC000"/>
               </w:rPr>
+              <w:lastRenderedPageBreak/>
               <w:t>(</w:t>
             </w:r>
             <w:r>
@@ -4689,11 +4697,7 @@
               <w:t>(</w:t>
             </w:r>
             <w:r>
-              <w:t>unknown_final_date['rec</w:t>
-            </w:r>
-            <w:r>
-              <w:lastRenderedPageBreak/>
-              <w:t xml:space="preserve">onsider'] </w:t>
+              <w:t xml:space="preserve">unknown_final_date['reconsider'] </w:t>
             </w:r>
             <w:r>
               <w:rPr>
@@ -5109,6 +5113,7 @@
               <w:rPr>
                 <w:shd w:val="clear" w:color="auto" w:fill="FFFFFF"/>
               </w:rPr>
+              <w:lastRenderedPageBreak/>
               <w:t>{%tr endif %}</w:t>
             </w:r>
           </w:p>
@@ -5168,12 +5173,6 @@
                 <w:shd w:val="clear" w:color="auto" w:fill="FFFFFF"/>
               </w:rPr>
               <w:br/>
-            </w:r>
-            <w:r>
-              <w:rPr>
-                <w:shd w:val="clear" w:color="auto" w:fill="FFFFFF"/>
-              </w:rPr>
-              <w:lastRenderedPageBreak/>
               <w:t>type_of_response in('modify', 'set aside') %}</w:t>
             </w:r>
           </w:p>
@@ -5204,7 +5203,6 @@
                 <w:rFonts w:eastAsia="Calibri"/>
                 <w:shd w:val="clear" w:color="auto" w:fill="FFFFFF"/>
               </w:rPr>
-              <w:lastRenderedPageBreak/>
               <w:t>expect_after_response_step</w:t>
             </w:r>
             <w:proofErr w:type="spellEnd"/>
@@ -5664,6 +5662,7 @@
               <w:rPr>
                 <w:shd w:val="clear" w:color="auto" w:fill="FFFFFF"/>
               </w:rPr>
+              <w:lastRenderedPageBreak/>
               <w:t>{%tr if respond_to_appeal in ('agree',</w:t>
             </w:r>
             <w:r>
@@ -5676,14 +5675,7 @@
               <w:rPr>
                 <w:shd w:val="clear" w:color="auto" w:fill="FFFFFF"/>
               </w:rPr>
-              <w:t xml:space="preserve">'some', 'none') </w:t>
-            </w:r>
-            <w:r>
-              <w:rPr>
-                <w:shd w:val="clear" w:color="auto" w:fill="FFFFFF"/>
-              </w:rPr>
-              <w:lastRenderedPageBreak/>
-              <w:t>%}</w:t>
+              <w:t>'some', 'none') %}</w:t>
             </w:r>
           </w:p>
         </w:tc>
@@ -5712,7 +5704,6 @@
               <w:rPr>
                 <w:rFonts w:eastAsia="Calibri"/>
               </w:rPr>
-              <w:lastRenderedPageBreak/>
               <w:t>appeal_response_step</w:t>
             </w:r>
             <w:proofErr w:type="spellEnd"/>
@@ -6165,7 +6156,11 @@
             </w:r>
             <w:proofErr w:type="spellEnd"/>
             <w:r>
-              <w:t xml:space="preserve"> }}</w:t>
+              <w:t xml:space="preserve"> </w:t>
+            </w:r>
+            <w:r>
+              <w:lastRenderedPageBreak/>
+              <w:t>}}</w:t>
             </w:r>
           </w:p>
         </w:tc>
@@ -6190,6 +6185,7 @@
               </w:rPr>
             </w:pPr>
             <w:r>
+              <w:lastRenderedPageBreak/>
               <w:t xml:space="preserve">{{p </w:t>
             </w:r>
             <w:r>
@@ -6199,7 +6195,11 @@
               <w:t>get_help</w:t>
             </w:r>
             <w:r>
-              <w:t>_content.docx")) }}</w:t>
+              <w:t>_cont</w:t>
+            </w:r>
+            <w:r>
+              <w:lastRenderedPageBreak/>
+              <w:t>ent.docx")) }}</w:t>
             </w:r>
           </w:p>
         </w:tc>
@@ -6210,6 +6210,7 @@
         <w:spacing w:beforeAutospacing="0" w:afterAutospacing="0"/>
       </w:pPr>
       <w:r>
+        <w:lastRenderedPageBreak/>
         <w:br w:type="textWrapping" w:clear="all"/>
       </w:r>
     </w:p>
@@ -6289,27 +6290,14 @@
     <w:r>
       <w:t xml:space="preserve"> of </w:t>
     </w:r>
-    <w:r>
-      <w:fldChar w:fldCharType="begin"/>
-    </w:r>
-    <w:r>
-      <w:instrText xml:space="preserve"> NUMPAGES \* ARABIC </w:instrText>
-    </w:r>
-    <w:r>
-      <w:fldChar w:fldCharType="separate"/>
-    </w:r>
-    <w:r>
-      <w:rPr>
-        <w:noProof/>
-      </w:rPr>
-      <w:t>50</w:t>
-    </w:r>
-    <w:r>
-      <w:rPr>
-        <w:noProof/>
-      </w:rPr>
-      <w:fldChar w:fldCharType="end"/>
-    </w:r>
+    <w:fldSimple w:instr=" NUMPAGES \* ARABIC ">
+      <w:r>
+        <w:rPr>
+          <w:noProof/>
+        </w:rPr>
+        <w:t>50</w:t>
+      </w:r>
+    </w:fldSimple>
     <w:r>
       <w:t xml:space="preserve"> pages</w:t>
     </w:r>
@@ -6326,10 +6314,10 @@
       <w:t xml:space="preserve"> </w:t>
     </w:r>
     <w:r>
-      <w:t>1</w:t>
+      <w:t>2</w:t>
     </w:r>
     <w:r>
-      <w:t>2</w:t>
+      <w:t>0</w:t>
     </w:r>
     <w:r>
       <w:t>, 202</w:t>
@@ -6367,21 +6355,11 @@
     <w:r>
       <w:t xml:space="preserve"> of </w:t>
     </w:r>
-    <w:r>
-      <w:fldChar w:fldCharType="begin"/>
-    </w:r>
-    <w:r>
-      <w:instrText xml:space="preserve"> NUMPAGES \* ARABIC </w:instrText>
-    </w:r>
-    <w:r>
-      <w:fldChar w:fldCharType="separate"/>
-    </w:r>
-    <w:r>
-      <w:t>47</w:t>
-    </w:r>
-    <w:r>
-      <w:fldChar w:fldCharType="end"/>
-    </w:r>
+    <w:fldSimple w:instr=" NUMPAGES \* ARABIC ">
+      <w:r>
+        <w:t>47</w:t>
+      </w:r>
+    </w:fldSimple>
     <w:r>
       <w:t xml:space="preserve"> pages</w:t>
     </w:r>

</xml_diff>